<commit_message>
balanceo de los datasets y correciones finales
</commit_message>
<xml_diff>
--- a/Docs/Informe.docx
+++ b/Docs/Informe.docx
@@ -15,7 +15,6 @@
           <w:lang w:val="es-ES"/>
         </w:rPr>
       </w:pPr>
-      <w:bookmarkStart w:id="0" w:name="_GoBack"/>
       <w:r>
         <w:rPr>
           <w:noProof/>
@@ -105,6 +104,7 @@
         <w:spacing w:after="200"/>
         <w:jc w:val="center"/>
         <w:rPr>
+          <w:rFonts w:hint="eastAsia"/>
           <w:b/>
           <w:sz w:val="48"/>
           <w:lang w:val="es-ES"/>
@@ -505,6 +505,7 @@
         <w:spacing w:after="0" w:line="240" w:lineRule="auto"/>
         <w:ind w:left="708"/>
         <w:rPr>
+          <w:rFonts w:hint="eastAsia"/>
           <w:sz w:val="18"/>
           <w:szCs w:val="18"/>
           <w:lang w:val="es-ES"/>
@@ -670,7 +671,6 @@
         <w:br w:type="page"/>
       </w:r>
     </w:p>
-    <w:bookmarkEnd w:id="0"/>
     <w:p>
       <w:pPr>
         <w:spacing w:after="0" w:line="240" w:lineRule="auto"/>
@@ -706,13 +706,7 @@
         <w:rPr>
           <w:lang w:val="es-ES"/>
         </w:rPr>
-        <w:t xml:space="preserve">El presente informe documenta las </w:t>
-      </w:r>
-      <w:r>
-        <w:rPr>
-          <w:lang w:val="es-ES"/>
-        </w:rPr>
-        <w:t xml:space="preserve">corridas realizadas con el módulo desarrollado para el agrupamiento adaptativo de perfiles fitness y evalúa los resultados obtenidos sobre los dos conjuntos de prueba. La implementación utiliza una variante simplificada basada en </w:t>
+        <w:t xml:space="preserve">El presente informe documenta las corridas realizadas con el módulo desarrollado para el agrupamiento adaptativo de perfiles fitness y evalúa los resultados obtenidos sobre los dos conjuntos de prueba. La implementación utiliza una variante simplificada basada en </w:t>
       </w:r>
       <w:proofErr w:type="spellStart"/>
       <w:r>
@@ -726,13 +720,7 @@
         <w:rPr>
           <w:lang w:val="es-ES"/>
         </w:rPr>
-        <w:t xml:space="preserve"> ART, por lo que la c</w:t>
-      </w:r>
-      <w:r>
-        <w:rPr>
-          <w:lang w:val="es-ES"/>
-        </w:rPr>
-        <w:t xml:space="preserve">antidad y composición de los </w:t>
+        <w:t xml:space="preserve"> ART, por lo que la cantidad y composición de los </w:t>
       </w:r>
       <w:proofErr w:type="spellStart"/>
       <w:r>
@@ -802,13 +790,7 @@
         <w:rPr>
           <w:lang w:val="es-ES"/>
         </w:rPr>
-        <w:t xml:space="preserve"> o matriz de confusión. La evaluación se </w:t>
-      </w:r>
-      <w:r>
-        <w:rPr>
-          <w:lang w:val="es-ES"/>
-        </w:rPr>
-        <w:t xml:space="preserve">centra en la cantidad y tamaño de los </w:t>
+        <w:t xml:space="preserve"> o matriz de confusión. La evaluación se centra en la cantidad y tamaño de los </w:t>
       </w:r>
       <w:proofErr w:type="spellStart"/>
       <w:r>
@@ -892,13 +874,7 @@
         <w:rPr>
           <w:lang w:val="es-ES"/>
         </w:rPr>
-        <w:t>Se ut</w:t>
-      </w:r>
-      <w:r>
-        <w:rPr>
-          <w:lang w:val="es-ES"/>
-        </w:rPr>
-        <w:t xml:space="preserve">ilizaron dos conjuntos derivados de un mismo </w:t>
+        <w:t xml:space="preserve">Se utilizaron dos conjuntos derivados de un mismo </w:t>
       </w:r>
       <w:proofErr w:type="spellStart"/>
       <w:r>
@@ -926,13 +902,57 @@
         <w:rPr>
           <w:lang w:val="es-ES"/>
         </w:rPr>
-        <w:t xml:space="preserve"> en un conjunto femenino y otro masculino. </w:t>
+        <w:t xml:space="preserve"> en un conjunto femenino y otro masculino</w:t>
+      </w:r>
+      <w:r>
+        <w:rPr>
+          <w:lang w:val="es-ES"/>
+        </w:rPr>
+        <w:t>.</w:t>
+      </w:r>
+      <w:r>
+        <w:rPr>
+          <w:lang w:val="es-ES"/>
+        </w:rPr>
+        <w:t xml:space="preserve"> </w:t>
+      </w:r>
+      <w:r>
+        <w:rPr>
+          <w:lang w:val="es-ES"/>
+        </w:rPr>
+        <w:t>El conjunto femenino posee 462 registros originales y el masculino 511</w:t>
+      </w:r>
+      <w:r>
+        <w:rPr>
+          <w:lang w:val="es-ES"/>
+        </w:rPr>
+        <w:t>.</w:t>
+      </w:r>
+      <w:r>
+        <w:rPr>
+          <w:lang w:val="es-ES"/>
+        </w:rPr>
+        <w:t xml:space="preserve"> Para evitar una diferencia de tamaño entre los conjuntos se seleccionaron aleatoriamente 462 registros masculinos (</w:t>
       </w:r>
       <w:proofErr w:type="spellStart"/>
       <w:r>
         <w:rPr>
           <w:lang w:val="es-ES"/>
         </w:rPr>
+        <w:t>random_state</w:t>
+      </w:r>
+      <w:proofErr w:type="spellEnd"/>
+      <w:r>
+        <w:rPr>
+          <w:lang w:val="es-ES"/>
+        </w:rPr>
+        <w:t xml:space="preserve">=42), reservando 49 registros masculinos no seleccionados. El conjunto femenino se mantuvo completo. Después de aplicar el filtro de edad de 20 a 40 años quedaron 215 registros femeninos y 221 masculinos. </w:t>
+      </w:r>
+      <w:proofErr w:type="spellStart"/>
+      <w:r>
+        <w:rPr>
+          <w:lang w:val="es-ES"/>
+        </w:rPr>
         <w:t>Gender</w:t>
       </w:r>
       <w:proofErr w:type="spellEnd"/>
@@ -940,14 +960,63 @@
         <w:rPr>
           <w:lang w:val="es-ES"/>
         </w:rPr>
-        <w:t xml:space="preserve"> se utilizó únicamente para construir los conjuntos y fue excluida antes del procesamiento de la red. El conjunto femenin</w:t>
-      </w:r>
-      <w:r>
-        <w:rPr>
-          <w:lang w:val="es-ES"/>
-        </w:rPr>
-        <w:t>o posee 462 registros originales y el masculino 511. Tras aplicar el filtro de edad de 20 a 40 años quedaron 215 y 242 perfiles, respectivamente.</w:t>
-      </w:r>
+        <w:t xml:space="preserve"> se empleó exclusivamente para separar los datos y no ingresó a la red. El balanceo no garantiza ausencia de sesgos ni equivalencia exacta después del filtro de edad.</w:t>
+      </w:r>
+    </w:p>
+    <w:p>
+      <w:pPr>
+        <w:rPr>
+          <w:lang w:val="es-ES"/>
+        </w:rPr>
+      </w:pPr>
+      <w:r>
+        <w:rPr>
+          <w:lang w:val="es-ES"/>
+        </w:rPr>
+        <w:pict>
+          <v:shape id="_x0000_s1029" type="#_x0000_t75" style="position:absolute;margin-left:47.65pt;margin-top:109.6pt;width:374.05pt;height:229.5pt;z-index:-251653120;mso-position-horizontal-relative:text;mso-position-vertical-relative:text;mso-width-relative:page;mso-height-relative:page" wrapcoords="-34 0 -34 21544 21600 21544 21600 0 -34 0">
+            <v:imagedata r:id="rId10" o:title="Control del balanceo por tipo de actividad"/>
+            <w10:wrap type="topAndBottom"/>
+          </v:shape>
+        </w:pict>
+      </w:r>
+      <w:r>
+        <w:rPr>
+          <w:bCs/>
+          <w:lang w:val="es-ES"/>
+        </w:rPr>
+        <w:t>Control del balanceo por actividad</w:t>
+      </w:r>
+      <w:r>
+        <w:rPr>
+          <w:b/>
+          <w:bCs/>
+          <w:lang w:val="es-ES"/>
+        </w:rPr>
+        <w:t>:</w:t>
+      </w:r>
+      <w:r>
+        <w:rPr>
+          <w:lang w:val="es-ES"/>
+        </w:rPr>
+        <w:t xml:space="preserve"> Como se observa en el gráfico, la distribución de los registros femeninos y masculinos presenta diferencias moderadas antes de aplicar el filtro etario. Luego de seleccionar a los usuarios de entre 20 y 40 años, las diferencias se reducen a entre 1 y 5 registros por actividad, evidenciando una distribución razonablemente equilibrada. Este procedimiento permitió mejorar la comparabilidad de ambos conjuntos sin forzar una igualdad exacta ni modificar artificialmente la composición de las actividades. Los 49 registros masculinos no seleccionados se conservaron como reserva y no participaron en las corridas experimentales</w:t>
+      </w:r>
+      <w:r>
+        <w:rPr>
+          <w:lang w:val="es-ES"/>
+        </w:rPr>
+        <w:t>.</w:t>
+      </w:r>
+      <w:bookmarkStart w:id="0" w:name="_GoBack"/>
+      <w:bookmarkEnd w:id="0"/>
+    </w:p>
+    <w:p>
+      <w:pPr>
+        <w:rPr>
+          <w:rFonts w:hint="eastAsia"/>
+          <w:lang w:val="es-ES"/>
+        </w:rPr>
+      </w:pPr>
     </w:p>
     <w:p>
       <w:pPr>
@@ -965,10 +1034,7 @@
         </w:rPr>
       </w:pPr>
       <w:r>
-        <w:t>Las entradas fueron Age, BMI, Resting_BPM, Workout_Type, Workout_Frequency (</w:t>
-      </w:r>
-      <w:r>
-        <w:t xml:space="preserve">days/week), Session_Duration (hours) y Calories_Burned. </w:t>
+        <w:t xml:space="preserve">Las entradas fueron Age, BMI, Resting_BPM, Workout_Type, Workout_Frequency (days/week), Session_Duration (hours) y Calories_Burned. </w:t>
       </w:r>
       <w:proofErr w:type="spellStart"/>
       <w:r>
@@ -1024,13 +1090,7 @@
         <w:rPr>
           <w:lang w:val="es-ES"/>
         </w:rPr>
-        <w:t xml:space="preserve"> no ingresó a la red: se conservó como referencia externa para la interpretación </w:t>
-      </w:r>
-      <w:r>
-        <w:rPr>
-          <w:lang w:val="es-ES"/>
-        </w:rPr>
-        <w:t>posterior.</w:t>
+        <w:t xml:space="preserve"> no ingresó a la red: se conservó como referencia externa para la interpretación posterior.</w:t>
       </w:r>
     </w:p>
     <w:p>
@@ -1312,13 +1372,7 @@
               <w:rPr>
                 <w:sz w:val="18"/>
               </w:rPr>
-              <w:t xml:space="preserve">Aprendizaje rápido; mantenido </w:t>
-            </w:r>
-            <w:r>
-              <w:rPr>
-                <w:sz w:val="18"/>
-              </w:rPr>
-              <w:t>constante.</w:t>
+              <w:t>Aprendizaje rápido; mantenido constante.</w:t>
             </w:r>
           </w:p>
         </w:tc>
@@ -1388,13 +1442,21 @@
         <w:rPr>
           <w:lang w:val="es-ES"/>
         </w:rPr>
-        <w:t>Se realizaron corridas var</w:t>
-      </w:r>
-      <w:r>
-        <w:rPr>
-          <w:lang w:val="es-ES"/>
-        </w:rPr>
-        <w:t xml:space="preserve">iando </w:t>
+        <w:t xml:space="preserve">Se repitieron las 14 corridas experimentales sobre los </w:t>
+      </w:r>
+      <w:proofErr w:type="spellStart"/>
+      <w:r>
+        <w:rPr>
+          <w:lang w:val="es-ES"/>
+        </w:rPr>
+        <w:t>datasets</w:t>
+      </w:r>
+      <w:proofErr w:type="spellEnd"/>
+      <w:r>
+        <w:rPr>
+          <w:lang w:val="es-ES"/>
+        </w:rPr>
+        <w:t xml:space="preserve"> definitivos balanceados: siete valores de vigilancia (</w:t>
       </w:r>
       <w:r>
         <w:t>ρ</w:t>
@@ -1403,7 +1465,25 @@
         <w:rPr>
           <w:lang w:val="es-ES"/>
         </w:rPr>
-        <w:t xml:space="preserve"> entre 0,60 y 0,90. El objetivo fue observar el compromiso entre especificidad de los grupos y fragmentación.</w:t>
+        <w:t xml:space="preserve">=0,60; 0,65; 0,70; 0,75; 0,80; 0,85; 0,90) por dos conjuntos. Se mantuvieron constantes </w:t>
+      </w:r>
+      <w:r>
+        <w:t>α</w:t>
+      </w:r>
+      <w:r>
+        <w:rPr>
+          <w:lang w:val="es-ES"/>
+        </w:rPr>
+        <w:t xml:space="preserve">=0,001 y </w:t>
+      </w:r>
+      <w:r>
+        <w:t>β</w:t>
+      </w:r>
+      <w:r>
+        <w:rPr>
+          <w:lang w:val="es-ES"/>
+        </w:rPr>
+        <w:t>=1,0. Los resultados siguientes corresponden exclusivamente a esta nueva evaluación.</w:t>
       </w:r>
     </w:p>
     <w:tbl>
@@ -1435,10 +1515,6 @@
               </w:rPr>
             </w:pPr>
             <w:r>
-              <w:rPr>
-                <w:b/>
-                <w:sz w:val="18"/>
-              </w:rPr>
               <w:t>ρ</w:t>
             </w:r>
           </w:p>
@@ -1456,11 +1532,10 @@
               </w:rPr>
             </w:pPr>
             <w:r>
-              <w:rPr>
-                <w:b/>
-                <w:sz w:val="18"/>
-              </w:rPr>
-              <w:t>Clusters femenino</w:t>
+              <w:t>Clusters femeni</w:t>
+            </w:r>
+            <w:r>
+              <w:t>no</w:t>
             </w:r>
           </w:p>
         </w:tc>
@@ -1477,10 +1552,6 @@
               </w:rPr>
             </w:pPr>
             <w:r>
-              <w:rPr>
-                <w:b/>
-                <w:sz w:val="18"/>
-              </w:rPr>
               <w:t>Clusters masculino</w:t>
             </w:r>
           </w:p>
@@ -1502,10 +1573,6 @@
               </w:rPr>
             </w:pPr>
             <w:r>
-              <w:rPr>
-                <w:sz w:val="18"/>
-              </w:rPr>
-              <w:lastRenderedPageBreak/>
               <w:t>0,60</w:t>
             </w:r>
           </w:p>
@@ -1522,9 +1589,6 @@
               </w:rPr>
             </w:pPr>
             <w:r>
-              <w:rPr>
-                <w:sz w:val="18"/>
-              </w:rPr>
               <w:t>35</w:t>
             </w:r>
           </w:p>
@@ -1541,10 +1605,7 @@
               </w:rPr>
             </w:pPr>
             <w:r>
-              <w:rPr>
-                <w:sz w:val="18"/>
-              </w:rPr>
-              <w:t>44</w:t>
+              <w:t>35</w:t>
             </w:r>
           </w:p>
         </w:tc>
@@ -1565,9 +1626,6 @@
               </w:rPr>
             </w:pPr>
             <w:r>
-              <w:rPr>
-                <w:sz w:val="18"/>
-              </w:rPr>
               <w:t>0,65</w:t>
             </w:r>
           </w:p>
@@ -1584,9 +1642,6 @@
               </w:rPr>
             </w:pPr>
             <w:r>
-              <w:rPr>
-                <w:sz w:val="18"/>
-              </w:rPr>
               <w:t>37</w:t>
             </w:r>
           </w:p>
@@ -1603,10 +1658,7 @@
               </w:rPr>
             </w:pPr>
             <w:r>
-              <w:rPr>
-                <w:sz w:val="18"/>
-              </w:rPr>
-              <w:t>42</w:t>
+              <w:t>50</w:t>
             </w:r>
           </w:p>
         </w:tc>
@@ -1627,9 +1679,6 @@
               </w:rPr>
             </w:pPr>
             <w:r>
-              <w:rPr>
-                <w:sz w:val="18"/>
-              </w:rPr>
               <w:t>0,70</w:t>
             </w:r>
           </w:p>
@@ -1646,9 +1695,6 @@
               </w:rPr>
             </w:pPr>
             <w:r>
-              <w:rPr>
-                <w:sz w:val="18"/>
-              </w:rPr>
               <w:t>44</w:t>
             </w:r>
           </w:p>
@@ -1665,10 +1711,7 @@
               </w:rPr>
             </w:pPr>
             <w:r>
-              <w:rPr>
-                <w:sz w:val="18"/>
-              </w:rPr>
-              <w:t>45</w:t>
+              <w:t>53</w:t>
             </w:r>
           </w:p>
         </w:tc>
@@ -1689,9 +1732,6 @@
               </w:rPr>
             </w:pPr>
             <w:r>
-              <w:rPr>
-                <w:sz w:val="18"/>
-              </w:rPr>
               <w:t>0,75</w:t>
             </w:r>
           </w:p>
@@ -1708,9 +1748,6 @@
               </w:rPr>
             </w:pPr>
             <w:r>
-              <w:rPr>
-                <w:sz w:val="18"/>
-              </w:rPr>
               <w:t>52</w:t>
             </w:r>
           </w:p>
@@ -1727,10 +1764,7 @@
               </w:rPr>
             </w:pPr>
             <w:r>
-              <w:rPr>
-                <w:sz w:val="18"/>
-              </w:rPr>
-              <w:t>55</w:t>
+              <w:t>52</w:t>
             </w:r>
           </w:p>
         </w:tc>
@@ -1751,9 +1785,6 @@
               </w:rPr>
             </w:pPr>
             <w:r>
-              <w:rPr>
-                <w:sz w:val="18"/>
-              </w:rPr>
               <w:t>0,80</w:t>
             </w:r>
           </w:p>
@@ -1770,9 +1801,6 @@
               </w:rPr>
             </w:pPr>
             <w:r>
-              <w:rPr>
-                <w:sz w:val="18"/>
-              </w:rPr>
               <w:t>57</w:t>
             </w:r>
           </w:p>
@@ -1789,10 +1817,7 @@
               </w:rPr>
             </w:pPr>
             <w:r>
-              <w:rPr>
-                <w:sz w:val="18"/>
-              </w:rPr>
-              <w:t>64</w:t>
+              <w:t>61</w:t>
             </w:r>
           </w:p>
         </w:tc>
@@ -1813,9 +1838,6 @@
               </w:rPr>
             </w:pPr>
             <w:r>
-              <w:rPr>
-                <w:sz w:val="18"/>
-              </w:rPr>
               <w:t>0,85</w:t>
             </w:r>
           </w:p>
@@ -1832,9 +1854,6 @@
               </w:rPr>
             </w:pPr>
             <w:r>
-              <w:rPr>
-                <w:sz w:val="18"/>
-              </w:rPr>
               <w:t>71</w:t>
             </w:r>
           </w:p>
@@ -1851,10 +1870,7 @@
               </w:rPr>
             </w:pPr>
             <w:r>
-              <w:rPr>
-                <w:sz w:val="18"/>
-              </w:rPr>
-              <w:t>80</w:t>
+              <w:t>77</w:t>
             </w:r>
           </w:p>
         </w:tc>
@@ -1875,9 +1891,6 @@
               </w:rPr>
             </w:pPr>
             <w:r>
-              <w:rPr>
-                <w:sz w:val="18"/>
-              </w:rPr>
               <w:t>0,90</w:t>
             </w:r>
           </w:p>
@@ -1894,9 +1907,6 @@
               </w:rPr>
             </w:pPr>
             <w:r>
-              <w:rPr>
-                <w:sz w:val="18"/>
-              </w:rPr>
               <w:t>91</w:t>
             </w:r>
           </w:p>
@@ -1913,10 +1923,7 @@
               </w:rPr>
             </w:pPr>
             <w:r>
-              <w:rPr>
-                <w:sz w:val="18"/>
-              </w:rPr>
-              <w:t>103</w:t>
+              <w:t>97</w:t>
             </w:r>
           </w:p>
         </w:tc>
@@ -1940,13 +1947,7 @@
         <w:rPr>
           <w:lang w:val="es-ES"/>
         </w:rPr>
-        <w:t xml:space="preserve">En términos </w:t>
-      </w:r>
-      <w:r>
-        <w:rPr>
-          <w:lang w:val="es-ES"/>
-        </w:rPr>
-        <w:t xml:space="preserve">generales, el incremento de la vigilancia produjo categorías más finas y una mayor cantidad de </w:t>
+        <w:t xml:space="preserve">En el conjunto femenino la cantidad de </w:t>
       </w:r>
       <w:proofErr w:type="spellStart"/>
       <w:r>
@@ -1960,59 +1961,7 @@
         <w:rPr>
           <w:lang w:val="es-ES"/>
         </w:rPr>
-        <w:t xml:space="preserve">. El caso masculino entre </w:t>
-      </w:r>
-      <w:r>
-        <w:t>ρ</w:t>
-      </w:r>
-      <w:r>
-        <w:rPr>
-          <w:lang w:val="es-ES"/>
-        </w:rPr>
-        <w:t xml:space="preserve">=0,60 y </w:t>
-      </w:r>
-      <w:r>
-        <w:t>ρ</w:t>
-      </w:r>
-      <w:r>
-        <w:rPr>
-          <w:lang w:val="es-ES"/>
-        </w:rPr>
-        <w:t xml:space="preserve">=0,65 no sigue una relación estrictamente </w:t>
-      </w:r>
-      <w:proofErr w:type="spellStart"/>
-      <w:r>
-        <w:rPr>
-          <w:lang w:val="es-ES"/>
-        </w:rPr>
-        <w:t>monotónica</w:t>
-      </w:r>
-      <w:proofErr w:type="spellEnd"/>
-      <w:r>
-        <w:rPr>
-          <w:lang w:val="es-ES"/>
-        </w:rPr>
-        <w:t xml:space="preserve"> (44 y 42 </w:t>
-      </w:r>
-      <w:proofErr w:type="spellStart"/>
-      <w:r>
-        <w:rPr>
-          <w:lang w:val="es-ES"/>
-        </w:rPr>
-        <w:t>clusters</w:t>
-      </w:r>
-      <w:proofErr w:type="spellEnd"/>
-      <w:r>
-        <w:rPr>
-          <w:lang w:val="es-ES"/>
-        </w:rPr>
-        <w:t>). Esto no se considera una contradicción: el a</w:t>
-      </w:r>
-      <w:r>
-        <w:rPr>
-          <w:lang w:val="es-ES"/>
-        </w:rPr>
-        <w:t>lgoritmo es incremental y la formación de prototipos depende de la secuencia de presentación y de las actualizaciones realizadas durante la corrida.</w:t>
+        <w:t xml:space="preserve"> aumentó de 35 a 91 al elevar la vigilancia de 0,60 a 0,90. En el masculino pasó de 35 a 97, aunque no de forma estrictamente creciente en todos los pasos (53 a 52 entre 0,70 y 0,75). Este comportamiento es posible en una red incremental, cuyos prototipos y asignaciones dependen de la secuencia de aprendizaje.</w:t>
       </w:r>
     </w:p>
     <w:tbl>
@@ -2044,10 +1993,6 @@
               </w:rPr>
             </w:pPr>
             <w:r>
-              <w:rPr>
-                <w:b/>
-                <w:sz w:val="18"/>
-              </w:rPr>
               <w:t>ρ</w:t>
             </w:r>
           </w:p>
@@ -2065,10 +2010,6 @@
               </w:rPr>
             </w:pPr>
             <w:r>
-              <w:rPr>
-                <w:b/>
-                <w:sz w:val="18"/>
-              </w:rPr>
               <w:t>Coherencia Workout femenino</w:t>
             </w:r>
           </w:p>
@@ -2086,11 +2027,10 @@
               </w:rPr>
             </w:pPr>
             <w:r>
-              <w:rPr>
-                <w:b/>
-                <w:sz w:val="18"/>
-              </w:rPr>
-              <w:t>Coherencia Workout masculino</w:t>
+              <w:t>Coherencia Wor</w:t>
+            </w:r>
+            <w:r>
+              <w:t>kout masculino</w:t>
             </w:r>
           </w:p>
         </w:tc>
@@ -2111,9 +2051,6 @@
               </w:rPr>
             </w:pPr>
             <w:r>
-              <w:rPr>
-                <w:sz w:val="18"/>
-              </w:rPr>
               <w:t>0,60</w:t>
             </w:r>
           </w:p>
@@ -2130,10 +2067,7 @@
               </w:rPr>
             </w:pPr>
             <w:r>
-              <w:rPr>
-                <w:sz w:val="18"/>
-              </w:rPr>
-              <w:t>≈ 80,9 %</w:t>
+              <w:t>80,93 %</w:t>
             </w:r>
           </w:p>
         </w:tc>
@@ -2149,10 +2083,7 @@
               </w:rPr>
             </w:pPr>
             <w:r>
-              <w:rPr>
-                <w:sz w:val="18"/>
-              </w:rPr>
-              <w:t>≈ 80,2 %</w:t>
+              <w:t>87,33 %</w:t>
             </w:r>
           </w:p>
         </w:tc>
@@ -2173,9 +2104,6 @@
               </w:rPr>
             </w:pPr>
             <w:r>
-              <w:rPr>
-                <w:sz w:val="18"/>
-              </w:rPr>
               <w:t>0,65</w:t>
             </w:r>
           </w:p>
@@ -2192,10 +2120,7 @@
               </w:rPr>
             </w:pPr>
             <w:r>
-              <w:rPr>
-                <w:sz w:val="18"/>
-              </w:rPr>
-              <w:t>≈ 87,4 %</w:t>
+              <w:t>87,44 %</w:t>
             </w:r>
           </w:p>
         </w:tc>
@@ -2211,10 +2136,7 @@
               </w:rPr>
             </w:pPr>
             <w:r>
-              <w:rPr>
-                <w:sz w:val="18"/>
-              </w:rPr>
-              <w:t>≈ 91,3 %</w:t>
+              <w:t>84,62 %</w:t>
             </w:r>
           </w:p>
         </w:tc>
@@ -2235,9 +2157,6 @@
               </w:rPr>
             </w:pPr>
             <w:r>
-              <w:rPr>
-                <w:sz w:val="18"/>
-              </w:rPr>
               <w:t>0,70</w:t>
             </w:r>
           </w:p>
@@ -2254,10 +2173,7 @@
               </w:rPr>
             </w:pPr>
             <w:r>
-              <w:rPr>
-                <w:sz w:val="18"/>
-              </w:rPr>
-              <w:t>≈ 95,8 %</w:t>
+              <w:t>95,81 %</w:t>
             </w:r>
           </w:p>
         </w:tc>
@@ -2273,10 +2189,7 @@
               </w:rPr>
             </w:pPr>
             <w:r>
-              <w:rPr>
-                <w:sz w:val="18"/>
-              </w:rPr>
-              <w:t>≈ 97,9 %</w:t>
+              <w:t>93,21 %</w:t>
             </w:r>
           </w:p>
         </w:tc>
@@ -2297,9 +2210,7 @@
               </w:rPr>
             </w:pPr>
             <w:r>
-              <w:rPr>
-                <w:sz w:val="18"/>
-              </w:rPr>
+              <w:lastRenderedPageBreak/>
               <w:t>0,75</w:t>
             </w:r>
           </w:p>
@@ -2316,10 +2227,7 @@
               </w:rPr>
             </w:pPr>
             <w:r>
-              <w:rPr>
-                <w:sz w:val="18"/>
-              </w:rPr>
-              <w:t>≈ 97,2 %</w:t>
+              <w:t>97,21 %</w:t>
             </w:r>
           </w:p>
         </w:tc>
@@ -2335,10 +2243,157 @@
               </w:rPr>
             </w:pPr>
             <w:r>
-              <w:rPr>
-                <w:sz w:val="18"/>
-              </w:rPr>
-              <w:t>≈ 98,8 %</w:t>
+              <w:t>97,74 %</w:t>
+            </w:r>
+          </w:p>
+        </w:tc>
+      </w:tr>
+      <w:tr>
+        <w:trPr>
+          <w:jc w:val="center"/>
+        </w:trPr>
+        <w:tc>
+          <w:tcPr>
+            <w:tcW w:w="3173" w:type="dxa"/>
+          </w:tcPr>
+          <w:p>
+            <w:pPr>
+              <w:rPr>
+                <w:rFonts w:hint="eastAsia"/>
+              </w:rPr>
+            </w:pPr>
+            <w:r>
+              <w:t>0,80</w:t>
+            </w:r>
+          </w:p>
+        </w:tc>
+        <w:tc>
+          <w:tcPr>
+            <w:tcW w:w="3173" w:type="dxa"/>
+          </w:tcPr>
+          <w:p>
+            <w:pPr>
+              <w:rPr>
+                <w:rFonts w:hint="eastAsia"/>
+              </w:rPr>
+            </w:pPr>
+            <w:r>
+              <w:t>99,53 %</w:t>
+            </w:r>
+          </w:p>
+        </w:tc>
+        <w:tc>
+          <w:tcPr>
+            <w:tcW w:w="3173" w:type="dxa"/>
+          </w:tcPr>
+          <w:p>
+            <w:pPr>
+              <w:rPr>
+                <w:rFonts w:hint="eastAsia"/>
+              </w:rPr>
+            </w:pPr>
+            <w:r>
+              <w:t>100,00 %</w:t>
+            </w:r>
+          </w:p>
+        </w:tc>
+      </w:tr>
+      <w:tr>
+        <w:trPr>
+          <w:jc w:val="center"/>
+        </w:trPr>
+        <w:tc>
+          <w:tcPr>
+            <w:tcW w:w="3173" w:type="dxa"/>
+          </w:tcPr>
+          <w:p>
+            <w:pPr>
+              <w:rPr>
+                <w:rFonts w:hint="eastAsia"/>
+              </w:rPr>
+            </w:pPr>
+            <w:r>
+              <w:t>0,85</w:t>
+            </w:r>
+          </w:p>
+        </w:tc>
+        <w:tc>
+          <w:tcPr>
+            <w:tcW w:w="3173" w:type="dxa"/>
+          </w:tcPr>
+          <w:p>
+            <w:pPr>
+              <w:rPr>
+                <w:rFonts w:hint="eastAsia"/>
+              </w:rPr>
+            </w:pPr>
+            <w:r>
+              <w:t>100,00 %</w:t>
+            </w:r>
+          </w:p>
+        </w:tc>
+        <w:tc>
+          <w:tcPr>
+            <w:tcW w:w="3173" w:type="dxa"/>
+          </w:tcPr>
+          <w:p>
+            <w:pPr>
+              <w:rPr>
+                <w:rFonts w:hint="eastAsia"/>
+              </w:rPr>
+            </w:pPr>
+            <w:r>
+              <w:t>100,00 %</w:t>
+            </w:r>
+          </w:p>
+        </w:tc>
+      </w:tr>
+      <w:tr>
+        <w:trPr>
+          <w:jc w:val="center"/>
+        </w:trPr>
+        <w:tc>
+          <w:tcPr>
+            <w:tcW w:w="3173" w:type="dxa"/>
+          </w:tcPr>
+          <w:p>
+            <w:pPr>
+              <w:rPr>
+                <w:rFonts w:hint="eastAsia"/>
+              </w:rPr>
+            </w:pPr>
+            <w:r>
+              <w:t>0,90</w:t>
+            </w:r>
+          </w:p>
+        </w:tc>
+        <w:tc>
+          <w:tcPr>
+            <w:tcW w:w="3173" w:type="dxa"/>
+          </w:tcPr>
+          <w:p>
+            <w:pPr>
+              <w:rPr>
+                <w:rFonts w:hint="eastAsia"/>
+              </w:rPr>
+            </w:pPr>
+            <w:r>
+              <w:t>100,00 %</w:t>
+            </w:r>
+          </w:p>
+        </w:tc>
+        <w:tc>
+          <w:tcPr>
+            <w:tcW w:w="3173" w:type="dxa"/>
+          </w:tcPr>
+          <w:p>
+            <w:pPr>
+              <w:rPr>
+                <w:rFonts w:hint="eastAsia"/>
+              </w:rPr>
+            </w:pPr>
+            <w:r>
+              <w:t>100,00 %</w:t>
             </w:r>
           </w:p>
         </w:tc>
@@ -2362,7 +2417,7 @@
         <w:rPr>
           <w:lang w:val="es-ES"/>
         </w:rPr>
-        <w:t xml:space="preserve">La coherencia anterior es un indicador descriptivo construido para este análisis: representa la proporción de usuarios que coincide con el </w:t>
+        <w:t xml:space="preserve">La coherencia de </w:t>
       </w:r>
       <w:proofErr w:type="spellStart"/>
       <w:r>
@@ -2376,7 +2431,7 @@
         <w:rPr>
           <w:lang w:val="es-ES"/>
         </w:rPr>
-        <w:t xml:space="preserve"> predominante de su </w:t>
+        <w:t xml:space="preserve"> es un indicador descriptivo propio de este análisis: porcentaje de registros que coincide con la actividad predominante de su </w:t>
       </w:r>
       <w:proofErr w:type="spellStart"/>
       <w:r>
@@ -2390,13 +2445,35 @@
         <w:rPr>
           <w:lang w:val="es-ES"/>
         </w:rPr>
-        <w:t xml:space="preserve">. No es una métrica oficial </w:t>
-      </w:r>
-      <w:r>
-        <w:rPr>
-          <w:lang w:val="es-ES"/>
-        </w:rPr>
-        <w:t>de ART ni una validación supervisada.</w:t>
+        <w:t xml:space="preserve">. No es </w:t>
+      </w:r>
+      <w:proofErr w:type="spellStart"/>
+      <w:r>
+        <w:rPr>
+          <w:lang w:val="es-ES"/>
+        </w:rPr>
+        <w:t>accuracy</w:t>
+      </w:r>
+      <w:proofErr w:type="spellEnd"/>
+      <w:r>
+        <w:rPr>
+          <w:lang w:val="es-ES"/>
+        </w:rPr>
+        <w:t xml:space="preserve">, ni una métrica oficial de ART, ni una validación supervisada. Su incremento puede deberse parcialmente a la fragmentación en grupos más pequeños; por ello se evalúa conjuntamente con la cantidad y tamaño de </w:t>
+      </w:r>
+      <w:proofErr w:type="spellStart"/>
+      <w:r>
+        <w:rPr>
+          <w:lang w:val="es-ES"/>
+        </w:rPr>
+        <w:t>clusters</w:t>
+      </w:r>
+      <w:proofErr w:type="spellEnd"/>
+      <w:r>
+        <w:rPr>
+          <w:lang w:val="es-ES"/>
+        </w:rPr>
+        <w:t>.</w:t>
       </w:r>
     </w:p>
     <w:tbl>
@@ -2429,15 +2506,9 @@
                 <w:rFonts w:hint="eastAsia"/>
               </w:rPr>
             </w:pPr>
-            <w:proofErr w:type="spellStart"/>
-            <w:r>
-              <w:rPr>
-                <w:b/>
-                <w:sz w:val="18"/>
-              </w:rPr>
+            <w:r>
               <w:t>Indicador</w:t>
             </w:r>
-            <w:proofErr w:type="spellEnd"/>
           </w:p>
         </w:tc>
         <w:tc>
@@ -2453,10 +2524,6 @@
               </w:rPr>
             </w:pPr>
             <w:r>
-              <w:rPr>
-                <w:b/>
-                <w:sz w:val="18"/>
-              </w:rPr>
               <w:t>ρ=0,70 femenino</w:t>
             </w:r>
           </w:p>
@@ -2474,10 +2541,6 @@
               </w:rPr>
             </w:pPr>
             <w:r>
-              <w:rPr>
-                <w:b/>
-                <w:sz w:val="18"/>
-              </w:rPr>
               <w:t>ρ=0,75 femenino</w:t>
             </w:r>
           </w:p>
@@ -2495,10 +2558,6 @@
               </w:rPr>
             </w:pPr>
             <w:r>
-              <w:rPr>
-                <w:b/>
-                <w:sz w:val="18"/>
-              </w:rPr>
               <w:t>ρ=0,70 masculino</w:t>
             </w:r>
           </w:p>
@@ -2516,10 +2575,6 @@
               </w:rPr>
             </w:pPr>
             <w:r>
-              <w:rPr>
-                <w:b/>
-                <w:sz w:val="18"/>
-              </w:rPr>
               <w:t>ρ=0,75 masculino</w:t>
             </w:r>
           </w:p>
@@ -2541,9 +2596,6 @@
               </w:rPr>
             </w:pPr>
             <w:r>
-              <w:rPr>
-                <w:sz w:val="18"/>
-              </w:rPr>
               <w:t>Cantidad de clusters</w:t>
             </w:r>
           </w:p>
@@ -2560,9 +2612,6 @@
               </w:rPr>
             </w:pPr>
             <w:r>
-              <w:rPr>
-                <w:sz w:val="18"/>
-              </w:rPr>
               <w:t>44</w:t>
             </w:r>
           </w:p>
@@ -2579,9 +2628,6 @@
               </w:rPr>
             </w:pPr>
             <w:r>
-              <w:rPr>
-                <w:sz w:val="18"/>
-              </w:rPr>
               <w:t>52</w:t>
             </w:r>
           </w:p>
@@ -2598,10 +2644,7 @@
               </w:rPr>
             </w:pPr>
             <w:r>
-              <w:rPr>
-                <w:sz w:val="18"/>
-              </w:rPr>
-              <w:t>45</w:t>
+              <w:t>53</w:t>
             </w:r>
           </w:p>
         </w:tc>
@@ -2617,10 +2660,7 @@
               </w:rPr>
             </w:pPr>
             <w:r>
-              <w:rPr>
-                <w:sz w:val="18"/>
-              </w:rPr>
-              <w:t>55</w:t>
+              <w:t>52</w:t>
             </w:r>
           </w:p>
         </w:tc>
@@ -2641,9 +2681,6 @@
               </w:rPr>
             </w:pPr>
             <w:r>
-              <w:rPr>
-                <w:sz w:val="18"/>
-              </w:rPr>
               <w:t>Clusters con ≤3 integrantes</w:t>
             </w:r>
           </w:p>
@@ -2660,9 +2697,6 @@
               </w:rPr>
             </w:pPr>
             <w:r>
-              <w:rPr>
-                <w:sz w:val="18"/>
-              </w:rPr>
               <w:t>12</w:t>
             </w:r>
           </w:p>
@@ -2679,9 +2713,6 @@
               </w:rPr>
             </w:pPr>
             <w:r>
-              <w:rPr>
-                <w:sz w:val="18"/>
-              </w:rPr>
               <w:t>22</w:t>
             </w:r>
           </w:p>
@@ -2698,10 +2729,7 @@
               </w:rPr>
             </w:pPr>
             <w:r>
-              <w:rPr>
-                <w:sz w:val="18"/>
-              </w:rPr>
-              <w:t>6</w:t>
+              <w:t>24</w:t>
             </w:r>
           </w:p>
         </w:tc>
@@ -2717,9 +2745,6 @@
               </w:rPr>
             </w:pPr>
             <w:r>
-              <w:rPr>
-                <w:sz w:val="18"/>
-              </w:rPr>
               <w:t>20</w:t>
             </w:r>
           </w:p>
@@ -2741,9 +2766,90 @@
               </w:rPr>
             </w:pPr>
             <w:r>
-              <w:rPr>
-                <w:sz w:val="18"/>
-              </w:rPr>
+              <w:t>Clusters de 1 integrante</w:t>
+            </w:r>
+          </w:p>
+        </w:tc>
+        <w:tc>
+          <w:tcPr>
+            <w:tcW w:w="1904" w:type="dxa"/>
+            <w:vAlign w:val="center"/>
+          </w:tcPr>
+          <w:p>
+            <w:pPr>
+              <w:rPr>
+                <w:rFonts w:hint="eastAsia"/>
+              </w:rPr>
+            </w:pPr>
+            <w:r>
+              <w:t>1</w:t>
+            </w:r>
+          </w:p>
+        </w:tc>
+        <w:tc>
+          <w:tcPr>
+            <w:tcW w:w="1904" w:type="dxa"/>
+            <w:vAlign w:val="center"/>
+          </w:tcPr>
+          <w:p>
+            <w:pPr>
+              <w:rPr>
+                <w:rFonts w:hint="eastAsia"/>
+              </w:rPr>
+            </w:pPr>
+            <w:r>
+              <w:t>4</w:t>
+            </w:r>
+          </w:p>
+        </w:tc>
+        <w:tc>
+          <w:tcPr>
+            <w:tcW w:w="1904" w:type="dxa"/>
+            <w:vAlign w:val="center"/>
+          </w:tcPr>
+          <w:p>
+            <w:pPr>
+              <w:rPr>
+                <w:rFonts w:hint="eastAsia"/>
+              </w:rPr>
+            </w:pPr>
+            <w:r>
+              <w:t>1</w:t>
+            </w:r>
+          </w:p>
+        </w:tc>
+        <w:tc>
+          <w:tcPr>
+            <w:tcW w:w="1904" w:type="dxa"/>
+            <w:vAlign w:val="center"/>
+          </w:tcPr>
+          <w:p>
+            <w:pPr>
+              <w:rPr>
+                <w:rFonts w:hint="eastAsia"/>
+              </w:rPr>
+            </w:pPr>
+            <w:r>
+              <w:t>1</w:t>
+            </w:r>
+          </w:p>
+        </w:tc>
+      </w:tr>
+      <w:tr>
+        <w:trPr>
+          <w:jc w:val="center"/>
+        </w:trPr>
+        <w:tc>
+          <w:tcPr>
+            <w:tcW w:w="1904" w:type="dxa"/>
+          </w:tcPr>
+          <w:p>
+            <w:pPr>
+              <w:rPr>
+                <w:rFonts w:hint="eastAsia"/>
+              </w:rPr>
+            </w:pPr>
+            <w:r>
               <w:t>Coherencia Workout</w:t>
             </w:r>
           </w:p>
@@ -2751,76 +2857,60 @@
         <w:tc>
           <w:tcPr>
             <w:tcW w:w="1904" w:type="dxa"/>
-            <w:vAlign w:val="center"/>
-          </w:tcPr>
-          <w:p>
-            <w:pPr>
-              <w:rPr>
-                <w:rFonts w:hint="eastAsia"/>
-              </w:rPr>
-            </w:pPr>
-            <w:r>
-              <w:rPr>
-                <w:sz w:val="18"/>
-              </w:rPr>
-              <w:t>≈95,8 %</w:t>
+          </w:tcPr>
+          <w:p>
+            <w:pPr>
+              <w:rPr>
+                <w:rFonts w:hint="eastAsia"/>
+              </w:rPr>
+            </w:pPr>
+            <w:r>
+              <w:t>95,81 %</w:t>
             </w:r>
           </w:p>
         </w:tc>
         <w:tc>
           <w:tcPr>
             <w:tcW w:w="1904" w:type="dxa"/>
-            <w:vAlign w:val="center"/>
-          </w:tcPr>
-          <w:p>
-            <w:pPr>
-              <w:rPr>
-                <w:rFonts w:hint="eastAsia"/>
-              </w:rPr>
-            </w:pPr>
-            <w:r>
-              <w:rPr>
-                <w:sz w:val="18"/>
-              </w:rPr>
-              <w:t>≈97,2 %</w:t>
+          </w:tcPr>
+          <w:p>
+            <w:pPr>
+              <w:rPr>
+                <w:rFonts w:hint="eastAsia"/>
+              </w:rPr>
+            </w:pPr>
+            <w:r>
+              <w:t>97,21 %</w:t>
             </w:r>
           </w:p>
         </w:tc>
         <w:tc>
           <w:tcPr>
             <w:tcW w:w="1904" w:type="dxa"/>
-            <w:vAlign w:val="center"/>
-          </w:tcPr>
-          <w:p>
-            <w:pPr>
-              <w:rPr>
-                <w:rFonts w:hint="eastAsia"/>
-              </w:rPr>
-            </w:pPr>
-            <w:r>
-              <w:rPr>
-                <w:sz w:val="18"/>
-              </w:rPr>
-              <w:t>≈97,9 %</w:t>
+          </w:tcPr>
+          <w:p>
+            <w:pPr>
+              <w:rPr>
+                <w:rFonts w:hint="eastAsia"/>
+              </w:rPr>
+            </w:pPr>
+            <w:r>
+              <w:t>93,21 %</w:t>
             </w:r>
           </w:p>
         </w:tc>
         <w:tc>
           <w:tcPr>
             <w:tcW w:w="1904" w:type="dxa"/>
-            <w:vAlign w:val="center"/>
-          </w:tcPr>
-          <w:p>
-            <w:pPr>
-              <w:rPr>
-                <w:rFonts w:hint="eastAsia"/>
-              </w:rPr>
-            </w:pPr>
-            <w:r>
-              <w:rPr>
-                <w:sz w:val="18"/>
-              </w:rPr>
-              <w:t>≈98,8 %</w:t>
+          </w:tcPr>
+          <w:p>
+            <w:pPr>
+              <w:rPr>
+                <w:rFonts w:hint="eastAsia"/>
+              </w:rPr>
+            </w:pPr>
+            <w:r>
+              <w:t>97,74 %</w:t>
             </w:r>
           </w:p>
         </w:tc>
@@ -2844,13 +2934,16 @@
         <w:rPr>
           <w:lang w:val="es-ES"/>
         </w:rPr>
-        <w:t xml:space="preserve">El paso de </w:t>
-      </w:r>
-      <w:r>
-        <w:rPr>
-          <w:lang w:val="es-ES"/>
-        </w:rPr>
-        <w:t xml:space="preserve">0,70 a 0,75 aportó una mejora pequeña en coherencia, pero aumentó de manera importante la cantidad de </w:t>
+        <w:t xml:space="preserve">Se conserva </w:t>
+      </w:r>
+      <w:r>
+        <w:t>ρ</w:t>
+      </w:r>
+      <w:r>
+        <w:rPr>
+          <w:lang w:val="es-ES"/>
+        </w:rPr>
+        <w:t xml:space="preserve">=0,70 como configuración común de compromiso, no como óptimo demostrado. En el conjunto femenino, pasar a 0,75 eleva la coherencia de 95,81 % a 97,21 %, pero aumenta los </w:t>
       </w:r>
       <w:proofErr w:type="spellStart"/>
       <w:r>
@@ -2864,22 +2957,217 @@
         <w:rPr>
           <w:lang w:val="es-ES"/>
         </w:rPr>
-        <w:t xml:space="preserve"> y los grupos pequeños. Por ello se seleccionó </w:t>
-      </w:r>
-      <w:r>
-        <w:t>ρ</w:t>
-      </w:r>
-      <w:r>
-        <w:rPr>
-          <w:lang w:val="es-ES"/>
-        </w:rPr>
-        <w:t xml:space="preserve">=0,70 como el mejor equilibrio entre las configuraciones evaluadas, sin afirmar que constituya un </w:t>
-      </w:r>
-      <w:r>
-        <w:rPr>
-          <w:lang w:val="es-ES"/>
-        </w:rPr>
-        <w:t>óptimo universal.</w:t>
+        <w:t xml:space="preserve"> de 44 a 52 y los grupos de tres o menos integrantes de 12 a 22. En el conjunto masculino, 0,75 sí presenta mejores indicadores descriptivos: coherencia de 93,21 % a 97,74 %, </w:t>
+      </w:r>
+      <w:proofErr w:type="spellStart"/>
+      <w:r>
+        <w:rPr>
+          <w:lang w:val="es-ES"/>
+        </w:rPr>
+        <w:t>clusters</w:t>
+      </w:r>
+      <w:proofErr w:type="spellEnd"/>
+      <w:r>
+        <w:rPr>
+          <w:lang w:val="es-ES"/>
+        </w:rPr>
+        <w:t xml:space="preserve"> de 53 a 52 y grupos pequeños de 24 a 20. Por tanto, 0,75 constituye una alternativa favorable para ese conjunto y debe reconocerse explícitamente. Se mantiene 0,70 para utilizar una sola configuración y evitar una fragmentación femenina adicional, sin afirmar superioridad universal.</w:t>
+      </w:r>
+    </w:p>
+    <w:p>
+      <w:pPr>
+        <w:jc w:val="center"/>
+        <w:rPr>
+          <w:rFonts w:hint="eastAsia"/>
+        </w:rPr>
+      </w:pPr>
+      <w:r>
+        <w:rPr>
+          <w:noProof/>
+        </w:rPr>
+        <w:drawing>
+          <wp:inline distT="0" distB="0" distL="0" distR="0">
+            <wp:extent cx="5120640" cy="2455101"/>
+            <wp:effectExtent l="0" t="0" r="0" b="0"/>
+            <wp:docPr id="1" name="Picture 1"/>
+            <wp:cNvGraphicFramePr>
+              <a:graphicFrameLocks xmlns:a="http://schemas.openxmlformats.org/drawingml/2006/main" noChangeAspect="1"/>
+            </wp:cNvGraphicFramePr>
+            <a:graphic xmlns:a="http://schemas.openxmlformats.org/drawingml/2006/main">
+              <a:graphicData uri="http://schemas.openxmlformats.org/drawingml/2006/picture">
+                <pic:pic xmlns:pic="http://schemas.openxmlformats.org/drawingml/2006/picture">
+                  <pic:nvPicPr>
+                    <pic:cNvPr id="0" name="grafico_fragmentacion_femenino.png"/>
+                    <pic:cNvPicPr/>
+                  </pic:nvPicPr>
+                  <pic:blipFill>
+                    <a:blip r:embed="rId11"/>
+                    <a:stretch>
+                      <a:fillRect/>
+                    </a:stretch>
+                  </pic:blipFill>
+                  <pic:spPr>
+                    <a:xfrm>
+                      <a:off x="0" y="0"/>
+                      <a:ext cx="5120640" cy="2455101"/>
+                    </a:xfrm>
+                    <a:prstGeom prst="rect">
+                      <a:avLst/>
+                    </a:prstGeom>
+                  </pic:spPr>
+                </pic:pic>
+              </a:graphicData>
+            </a:graphic>
+          </wp:inline>
+        </w:drawing>
+      </w:r>
+    </w:p>
+    <w:p>
+      <w:pPr>
+        <w:jc w:val="center"/>
+        <w:rPr>
+          <w:rFonts w:hint="eastAsia"/>
+          <w:lang w:val="es-ES"/>
+        </w:rPr>
+      </w:pPr>
+      <w:r>
+        <w:rPr>
+          <w:lang w:val="es-ES"/>
+        </w:rPr>
+        <w:t>Figura 1. Evolución de la fragmentación en el conjunto</w:t>
+      </w:r>
+      <w:r>
+        <w:rPr>
+          <w:lang w:val="es-ES"/>
+        </w:rPr>
+        <w:t xml:space="preserve"> femenino.</w:t>
+      </w:r>
+    </w:p>
+    <w:p>
+      <w:pPr>
+        <w:jc w:val="center"/>
+        <w:rPr>
+          <w:rFonts w:hint="eastAsia"/>
+        </w:rPr>
+      </w:pPr>
+      <w:r>
+        <w:rPr>
+          <w:noProof/>
+        </w:rPr>
+        <w:lastRenderedPageBreak/>
+        <w:drawing>
+          <wp:inline distT="0" distB="0" distL="0" distR="0">
+            <wp:extent cx="5120640" cy="2455101"/>
+            <wp:effectExtent l="0" t="0" r="0" b="0"/>
+            <wp:docPr id="2" name="Picture 2"/>
+            <wp:cNvGraphicFramePr>
+              <a:graphicFrameLocks xmlns:a="http://schemas.openxmlformats.org/drawingml/2006/main" noChangeAspect="1"/>
+            </wp:cNvGraphicFramePr>
+            <a:graphic xmlns:a="http://schemas.openxmlformats.org/drawingml/2006/main">
+              <a:graphicData uri="http://schemas.openxmlformats.org/drawingml/2006/picture">
+                <pic:pic xmlns:pic="http://schemas.openxmlformats.org/drawingml/2006/picture">
+                  <pic:nvPicPr>
+                    <pic:cNvPr id="0" name="grafico_fragmentacion_masculino.png"/>
+                    <pic:cNvPicPr/>
+                  </pic:nvPicPr>
+                  <pic:blipFill>
+                    <a:blip r:embed="rId12"/>
+                    <a:stretch>
+                      <a:fillRect/>
+                    </a:stretch>
+                  </pic:blipFill>
+                  <pic:spPr>
+                    <a:xfrm>
+                      <a:off x="0" y="0"/>
+                      <a:ext cx="5120640" cy="2455101"/>
+                    </a:xfrm>
+                    <a:prstGeom prst="rect">
+                      <a:avLst/>
+                    </a:prstGeom>
+                  </pic:spPr>
+                </pic:pic>
+              </a:graphicData>
+            </a:graphic>
+          </wp:inline>
+        </w:drawing>
+      </w:r>
+    </w:p>
+    <w:p>
+      <w:pPr>
+        <w:jc w:val="center"/>
+        <w:rPr>
+          <w:rFonts w:hint="eastAsia"/>
+          <w:lang w:val="es-ES"/>
+        </w:rPr>
+      </w:pPr>
+      <w:r>
+        <w:rPr>
+          <w:lang w:val="es-ES"/>
+        </w:rPr>
+        <w:t>Figura 2. Evolución de la fragmentación en el conjunto masculino.</w:t>
+      </w:r>
+    </w:p>
+    <w:p>
+      <w:pPr>
+        <w:jc w:val="center"/>
+        <w:rPr>
+          <w:rFonts w:hint="eastAsia"/>
+        </w:rPr>
+      </w:pPr>
+      <w:r>
+        <w:rPr>
+          <w:noProof/>
+        </w:rPr>
+        <w:drawing>
+          <wp:inline distT="0" distB="0" distL="0" distR="0">
+            <wp:extent cx="5120640" cy="2491122"/>
+            <wp:effectExtent l="0" t="0" r="0" b="0"/>
+            <wp:docPr id="3" name="Picture 3"/>
+            <wp:cNvGraphicFramePr>
+              <a:graphicFrameLocks xmlns:a="http://schemas.openxmlformats.org/drawingml/2006/main" noChangeAspect="1"/>
+            </wp:cNvGraphicFramePr>
+            <a:graphic xmlns:a="http://schemas.openxmlformats.org/drawingml/2006/main">
+              <a:graphicData uri="http://schemas.openxmlformats.org/drawingml/2006/picture">
+                <pic:pic xmlns:pic="http://schemas.openxmlformats.org/drawingml/2006/picture">
+                  <pic:nvPicPr>
+                    <pic:cNvPr id="0" name="grafico_coherencia.png"/>
+                    <pic:cNvPicPr/>
+                  </pic:nvPicPr>
+                  <pic:blipFill>
+                    <a:blip r:embed="rId13"/>
+                    <a:stretch>
+                      <a:fillRect/>
+                    </a:stretch>
+                  </pic:blipFill>
+                  <pic:spPr>
+                    <a:xfrm>
+                      <a:off x="0" y="0"/>
+                      <a:ext cx="5120640" cy="2491122"/>
+                    </a:xfrm>
+                    <a:prstGeom prst="rect">
+                      <a:avLst/>
+                    </a:prstGeom>
+                  </pic:spPr>
+                </pic:pic>
+              </a:graphicData>
+            </a:graphic>
+          </wp:inline>
+        </w:drawing>
+      </w:r>
+    </w:p>
+    <w:p>
+      <w:pPr>
+        <w:jc w:val="center"/>
+        <w:rPr>
+          <w:rFonts w:hint="eastAsia"/>
+          <w:lang w:val="es-ES"/>
+        </w:rPr>
+      </w:pPr>
+      <w:r>
+        <w:rPr>
+          <w:lang w:val="es-ES"/>
+        </w:rPr>
+        <w:t>Figura 3. Coherencia descriptiva por actividad; debe leerse junto con la fragmentación.</w:t>
       </w:r>
     </w:p>
     <w:p>
@@ -2969,13 +3257,7 @@
         <w:rPr>
           <w:lang w:val="es-ES"/>
         </w:rPr>
-        <w:t>cl</w:t>
-      </w:r>
-      <w:r>
-        <w:rPr>
-          <w:lang w:val="es-ES"/>
-        </w:rPr>
-        <w:t>uster</w:t>
+        <w:t>cluster</w:t>
       </w:r>
       <w:proofErr w:type="spellEnd"/>
       <w:r>
@@ -3595,7 +3877,6 @@
               <w:rPr>
                 <w:sz w:val="18"/>
               </w:rPr>
-              <w:lastRenderedPageBreak/>
               <w:t>16</w:t>
             </w:r>
           </w:p>
@@ -3962,13 +4243,7 @@
         <w:rPr>
           <w:lang w:val="es-ES"/>
         </w:rPr>
-        <w:t xml:space="preserve"> aporta una </w:t>
-      </w:r>
-      <w:r>
-        <w:rPr>
-          <w:lang w:val="es-ES"/>
-        </w:rPr>
-        <w:t xml:space="preserve">señal fuerte, pero no determina por sí solo la categoría. Por ejemplo, entre </w:t>
+        <w:t xml:space="preserve"> aporta una señal fuerte, pero no determina por sí solo la categoría. Por ejemplo, entre </w:t>
       </w:r>
       <w:proofErr w:type="spellStart"/>
       <w:r>
@@ -4024,13 +4299,7 @@
         <w:rPr>
           <w:lang w:val="es-ES"/>
         </w:rPr>
-        <w:t xml:space="preserve"> 18 presenta frecuencia 3,57, duración 1,35 h y 967,86</w:t>
-      </w:r>
-      <w:r>
-        <w:rPr>
-          <w:lang w:val="es-ES"/>
-        </w:rPr>
-        <w:t xml:space="preserve"> calorías. Esto evidencia que perfiles con el mismo tipo de entrenamiento pueden separarse según el resto de las variables.</w:t>
+        <w:t xml:space="preserve"> 18 presenta frecuencia 3,57, duración 1,35 h y 967,86 calorías. Esto evidencia que perfiles con el mismo tipo de entrenamiento pueden separarse según el resto de las variables.</w:t>
       </w:r>
     </w:p>
     <w:p>
@@ -4052,13 +4321,7 @@
         <w:rPr>
           <w:lang w:val="es-ES"/>
         </w:rPr>
-        <w:t xml:space="preserve"> presentó una predominancia ponderada aproximada de 66.5 %. Como no fue utilizado como entrada, este resultado se in</w:t>
-      </w:r>
-      <w:r>
-        <w:rPr>
-          <w:lang w:val="es-ES"/>
-        </w:rPr>
-        <w:t xml:space="preserve">terpreta solo como una referencia externa: existe cierta regularidad, pero no una correspondencia suficiente para considerarlo una etiqueta verdadera de los </w:t>
+        <w:t xml:space="preserve"> presentó una predominancia ponderada aproximada de 66.5 %. Como no fue utilizado como entrada, este resultado se interpreta solo como una referencia externa: existe cierta regularidad, pero no una correspondencia suficiente para considerarlo una etiqueta verdadera de los </w:t>
       </w:r>
       <w:proofErr w:type="spellStart"/>
       <w:r>
@@ -4107,19 +4370,14 @@
       <w:pPr>
         <w:rPr>
           <w:rFonts w:hint="eastAsia"/>
+          <w:lang w:val="es-ES"/>
         </w:rPr>
       </w:pPr>
       <w:r>
         <w:rPr>
           <w:lang w:val="es-ES"/>
         </w:rPr>
-        <w:t xml:space="preserve">La corrida final procesó 242 perfiles y produjo </w:t>
-      </w:r>
-      <w:r>
-        <w:rPr>
-          <w:lang w:val="es-ES"/>
-        </w:rPr>
-        <w:t xml:space="preserve">45 </w:t>
+        <w:t xml:space="preserve">La corrida definitiva masculina procesó 221 perfiles y generó 53 </w:t>
       </w:r>
       <w:proofErr w:type="spellStart"/>
       <w:r>
@@ -4133,82 +4391,44 @@
         <w:rPr>
           <w:lang w:val="es-ES"/>
         </w:rPr>
-        <w:t xml:space="preserve">. 42 </w:t>
+        <w:t xml:space="preserve">. De ellos, 39 fueron completamente homogéneos en </w:t>
       </w:r>
       <w:proofErr w:type="spellStart"/>
       <w:r>
         <w:rPr>
           <w:lang w:val="es-ES"/>
         </w:rPr>
-        <w:t>clusters</w:t>
+        <w:t>Workout_Type</w:t>
       </w:r>
       <w:proofErr w:type="spellEnd"/>
       <w:r>
         <w:rPr>
           <w:lang w:val="es-ES"/>
         </w:rPr>
-        <w:t xml:space="preserve"> fueron completamente homogéneos respecto de </w:t>
+        <w:t xml:space="preserve">; 24 reunieron tres usuarios o menos, uno fue </w:t>
       </w:r>
       <w:proofErr w:type="spellStart"/>
       <w:r>
         <w:rPr>
           <w:lang w:val="es-ES"/>
         </w:rPr>
-        <w:t>Workout_Type</w:t>
+        <w:t>singleton</w:t>
       </w:r>
       <w:proofErr w:type="spellEnd"/>
       <w:r>
         <w:rPr>
           <w:lang w:val="es-ES"/>
         </w:rPr>
-        <w:t xml:space="preserve">; 6 tuvieron tres integrantes o menos, 1 fue </w:t>
-      </w:r>
-      <w:proofErr w:type="spellStart"/>
-      <w:r>
-        <w:rPr>
-          <w:lang w:val="es-ES"/>
-        </w:rPr>
-        <w:t>singleton</w:t>
-      </w:r>
-      <w:proofErr w:type="spellEnd"/>
-      <w:r>
-        <w:rPr>
-          <w:lang w:val="es-ES"/>
-        </w:rPr>
-        <w:t xml:space="preserve"> y el mayor </w:t>
-      </w:r>
-      <w:proofErr w:type="spellStart"/>
-      <w:r>
-        <w:rPr>
-          <w:lang w:val="es-ES"/>
-        </w:rPr>
-        <w:t>cluster</w:t>
-      </w:r>
-      <w:proofErr w:type="spellEnd"/>
-      <w:r>
-        <w:rPr>
-          <w:lang w:val="es-ES"/>
-        </w:rPr>
-        <w:t xml:space="preserve"> reunió 10 usuarios. </w:t>
-      </w:r>
-      <w:r>
-        <w:t xml:space="preserve">La </w:t>
-      </w:r>
-      <w:proofErr w:type="spellStart"/>
-      <w:r>
-        <w:t>coherencia</w:t>
-      </w:r>
-      <w:proofErr w:type="spellEnd"/>
-      <w:r>
-        <w:t xml:space="preserve"> </w:t>
-      </w:r>
-      <w:proofErr w:type="spellStart"/>
-      <w:r>
-        <w:t>ponderada</w:t>
-      </w:r>
-      <w:proofErr w:type="spellEnd"/>
-      <w:r>
-        <w:t xml:space="preserve"> de Workout_Type alcanzó aproximadamente 97.9 %.</w:t>
+        <w:t xml:space="preserve"> y el mayor agrupó 10 usuarios. La coherencia ponderada por actividad fue 93,21 %. Estos resultados corresponden a la muestra masculina balanceada y a </w:t>
+      </w:r>
+      <w:r>
+        <w:t>ρ</w:t>
+      </w:r>
+      <w:r>
+        <w:rPr>
+          <w:lang w:val="es-ES"/>
+        </w:rPr>
+        <w:t>=0,70.</w:t>
       </w:r>
     </w:p>
     <w:tbl>
@@ -4219,15 +4439,15 @@
         <w:tblLook w:val="04A0" w:firstRow="1" w:lastRow="0" w:firstColumn="1" w:lastColumn="0" w:noHBand="0" w:noVBand="1"/>
       </w:tblPr>
       <w:tblGrid>
-        <w:gridCol w:w="1052"/>
-        <w:gridCol w:w="1055"/>
-        <w:gridCol w:w="1055"/>
-        <w:gridCol w:w="1296"/>
+        <w:gridCol w:w="1021"/>
+        <w:gridCol w:w="1044"/>
+        <w:gridCol w:w="1044"/>
+        <w:gridCol w:w="1371"/>
+        <w:gridCol w:w="1002"/>
+        <w:gridCol w:w="1028"/>
+        <w:gridCol w:w="1138"/>
         <w:gridCol w:w="1049"/>
-        <w:gridCol w:w="1052"/>
-        <w:gridCol w:w="1066"/>
-        <w:gridCol w:w="1055"/>
-        <w:gridCol w:w="1054"/>
+        <w:gridCol w:w="1037"/>
       </w:tblGrid>
       <w:tr>
         <w:trPr>
@@ -4246,10 +4466,6 @@
               </w:rPr>
             </w:pPr>
             <w:r>
-              <w:rPr>
-                <w:b/>
-                <w:sz w:val="18"/>
-              </w:rPr>
               <w:t>Cluster</w:t>
             </w:r>
           </w:p>
@@ -4267,18 +4483,7 @@
               </w:rPr>
             </w:pPr>
             <w:r>
-              <w:rPr>
-                <w:b/>
-                <w:sz w:val="18"/>
-              </w:rPr>
-              <w:t>U</w:t>
-            </w:r>
-            <w:r>
-              <w:rPr>
-                <w:b/>
-                <w:sz w:val="18"/>
-              </w:rPr>
-              <w:t>suarios</w:t>
+              <w:t>Usuarios</w:t>
             </w:r>
           </w:p>
         </w:tc>
@@ -4295,10 +4500,6 @@
               </w:rPr>
             </w:pPr>
             <w:r>
-              <w:rPr>
-                <w:b/>
-                <w:sz w:val="18"/>
-              </w:rPr>
               <w:t>Workout</w:t>
             </w:r>
           </w:p>
@@ -4316,10 +4517,6 @@
               </w:rPr>
             </w:pPr>
             <w:r>
-              <w:rPr>
-                <w:b/>
-                <w:sz w:val="18"/>
-              </w:rPr>
               <w:t>Exp. predominante</w:t>
             </w:r>
           </w:p>
@@ -4337,10 +4534,6 @@
               </w:rPr>
             </w:pPr>
             <w:r>
-              <w:rPr>
-                <w:b/>
-                <w:sz w:val="18"/>
-              </w:rPr>
               <w:t>BMI</w:t>
             </w:r>
           </w:p>
@@ -4358,11 +4551,10 @@
               </w:rPr>
             </w:pPr>
             <w:r>
-              <w:rPr>
-                <w:b/>
-                <w:sz w:val="18"/>
-              </w:rPr>
-              <w:t>Resting BPM</w:t>
+              <w:t xml:space="preserve">Resting </w:t>
+            </w:r>
+            <w:r>
+              <w:t>BPM</w:t>
             </w:r>
           </w:p>
         </w:tc>
@@ -4379,10 +4571,6 @@
               </w:rPr>
             </w:pPr>
             <w:r>
-              <w:rPr>
-                <w:b/>
-                <w:sz w:val="18"/>
-              </w:rPr>
               <w:t>Frecuencia</w:t>
             </w:r>
           </w:p>
@@ -4400,10 +4588,6 @@
               </w:rPr>
             </w:pPr>
             <w:r>
-              <w:rPr>
-                <w:b/>
-                <w:sz w:val="18"/>
-              </w:rPr>
               <w:t>Duración</w:t>
             </w:r>
           </w:p>
@@ -4421,10 +4605,6 @@
               </w:rPr>
             </w:pPr>
             <w:r>
-              <w:rPr>
-                <w:b/>
-                <w:sz w:val="18"/>
-              </w:rPr>
               <w:t>Calorías</w:t>
             </w:r>
           </w:p>
@@ -4446,10 +4626,7 @@
               </w:rPr>
             </w:pPr>
             <w:r>
-              <w:rPr>
-                <w:sz w:val="18"/>
-              </w:rPr>
-              <w:t>8</w:t>
+              <w:t>3</w:t>
             </w:r>
           </w:p>
         </w:tc>
@@ -4465,9 +4642,6 @@
               </w:rPr>
             </w:pPr>
             <w:r>
-              <w:rPr>
-                <w:sz w:val="18"/>
-              </w:rPr>
               <w:t>10</w:t>
             </w:r>
           </w:p>
@@ -4484,10 +4658,7 @@
               </w:rPr>
             </w:pPr>
             <w:r>
-              <w:rPr>
-                <w:sz w:val="18"/>
-              </w:rPr>
-              <w:t>Strength 100 %</w:t>
+              <w:t>HIIT 100,00 %</w:t>
             </w:r>
           </w:p>
         </w:tc>
@@ -4503,10 +4674,7 @@
               </w:rPr>
             </w:pPr>
             <w:r>
-              <w:rPr>
-                <w:sz w:val="18"/>
-              </w:rPr>
-              <w:t>2 (70,00 %)</w:t>
+              <w:t>2 (60,00 %)</w:t>
             </w:r>
           </w:p>
         </w:tc>
@@ -4522,10 +4690,7 @@
               </w:rPr>
             </w:pPr>
             <w:r>
-              <w:rPr>
-                <w:sz w:val="18"/>
-              </w:rPr>
-              <w:t>25,09</w:t>
+              <w:t>30,20</w:t>
             </w:r>
           </w:p>
         </w:tc>
@@ -4541,10 +4706,7 @@
               </w:rPr>
             </w:pPr>
             <w:r>
-              <w:rPr>
-                <w:sz w:val="18"/>
-              </w:rPr>
-              <w:t>66,10</w:t>
+              <w:t>58,80</w:t>
             </w:r>
           </w:p>
         </w:tc>
@@ -4560,10 +4722,7 @@
               </w:rPr>
             </w:pPr>
             <w:r>
-              <w:rPr>
-                <w:sz w:val="18"/>
-              </w:rPr>
-              <w:t>3,10</w:t>
+              <w:t>3,20</w:t>
             </w:r>
           </w:p>
         </w:tc>
@@ -4579,10 +4738,7 @@
               </w:rPr>
             </w:pPr>
             <w:r>
-              <w:rPr>
-                <w:sz w:val="18"/>
-              </w:rPr>
-              <w:t>1,21 h</w:t>
+              <w:t>1,24 h</w:t>
             </w:r>
           </w:p>
         </w:tc>
@@ -4598,10 +4754,7 @@
               </w:rPr>
             </w:pPr>
             <w:r>
-              <w:rPr>
-                <w:sz w:val="18"/>
-              </w:rPr>
-              <w:t>960,70</w:t>
+              <w:t>950,50</w:t>
             </w:r>
           </w:p>
         </w:tc>
@@ -4622,10 +4775,7 @@
               </w:rPr>
             </w:pPr>
             <w:r>
-              <w:rPr>
-                <w:sz w:val="18"/>
-              </w:rPr>
-              <w:t>7</w:t>
+              <w:t>17</w:t>
             </w:r>
           </w:p>
         </w:tc>
@@ -4641,9 +4791,6 @@
               </w:rPr>
             </w:pPr>
             <w:r>
-              <w:rPr>
-                <w:sz w:val="18"/>
-              </w:rPr>
               <w:t>9</w:t>
             </w:r>
           </w:p>
@@ -4660,10 +4807,7 @@
               </w:rPr>
             </w:pPr>
             <w:r>
-              <w:rPr>
-                <w:sz w:val="18"/>
-              </w:rPr>
-              <w:t>HIIT 100 %</w:t>
+              <w:t>Strength 100,00 %</w:t>
             </w:r>
           </w:p>
         </w:tc>
@@ -4679,10 +4823,7 @@
               </w:rPr>
             </w:pPr>
             <w:r>
-              <w:rPr>
-                <w:sz w:val="18"/>
-              </w:rPr>
-              <w:t>3 (44,44 %)</w:t>
+              <w:t>3 (33,33 %)</w:t>
             </w:r>
           </w:p>
         </w:tc>
@@ -4698,10 +4839,7 @@
               </w:rPr>
             </w:pPr>
             <w:r>
-              <w:rPr>
-                <w:sz w:val="18"/>
-              </w:rPr>
-              <w:t>32,52</w:t>
+              <w:t>24,99</w:t>
             </w:r>
           </w:p>
         </w:tc>
@@ -4717,10 +4855,7 @@
               </w:rPr>
             </w:pPr>
             <w:r>
-              <w:rPr>
-                <w:sz w:val="18"/>
-              </w:rPr>
-              <w:t>60,33</w:t>
+              <w:t>55,78</w:t>
             </w:r>
           </w:p>
         </w:tc>
@@ -4736,10 +4871,7 @@
               </w:rPr>
             </w:pPr>
             <w:r>
-              <w:rPr>
-                <w:sz w:val="18"/>
-              </w:rPr>
-              <w:t>3,89</w:t>
+              <w:t>3,67</w:t>
             </w:r>
           </w:p>
         </w:tc>
@@ -4755,10 +4887,7 @@
               </w:rPr>
             </w:pPr>
             <w:r>
-              <w:rPr>
-                <w:sz w:val="18"/>
-              </w:rPr>
-              <w:t>1,42 h</w:t>
+              <w:t>1,53 h</w:t>
             </w:r>
           </w:p>
         </w:tc>
@@ -4774,10 +4903,7 @@
               </w:rPr>
             </w:pPr>
             <w:r>
-              <w:rPr>
-                <w:sz w:val="18"/>
-              </w:rPr>
-              <w:t>1174,00</w:t>
+              <w:t>1155,78</w:t>
             </w:r>
           </w:p>
         </w:tc>
@@ -4798,10 +4924,7 @@
               </w:rPr>
             </w:pPr>
             <w:r>
-              <w:rPr>
-                <w:sz w:val="18"/>
-              </w:rPr>
-              <w:t>29</w:t>
+              <w:t>20</w:t>
             </w:r>
           </w:p>
         </w:tc>
@@ -4817,10 +4940,7 @@
               </w:rPr>
             </w:pPr>
             <w:r>
-              <w:rPr>
-                <w:sz w:val="18"/>
-              </w:rPr>
-              <w:t>9</w:t>
+              <w:t>8</w:t>
             </w:r>
           </w:p>
         </w:tc>
@@ -4836,10 +4956,7 @@
               </w:rPr>
             </w:pPr>
             <w:r>
-              <w:rPr>
-                <w:sz w:val="18"/>
-              </w:rPr>
-              <w:t>Cardio 100 %</w:t>
+              <w:t>Cardio 100,00 %</w:t>
             </w:r>
           </w:p>
         </w:tc>
@@ -4855,10 +4972,7 @@
               </w:rPr>
             </w:pPr>
             <w:r>
-              <w:rPr>
-                <w:sz w:val="18"/>
-              </w:rPr>
-              <w:t>2 (66,67 %)</w:t>
+              <w:t>2 (75,00 %)</w:t>
             </w:r>
           </w:p>
         </w:tc>
@@ -4874,10 +4988,7 @@
               </w:rPr>
             </w:pPr>
             <w:r>
-              <w:rPr>
-                <w:sz w:val="18"/>
-              </w:rPr>
-              <w:t>24,03</w:t>
+              <w:t>30,65</w:t>
             </w:r>
           </w:p>
         </w:tc>
@@ -4893,10 +5004,7 @@
               </w:rPr>
             </w:pPr>
             <w:r>
-              <w:rPr>
-                <w:sz w:val="18"/>
-              </w:rPr>
-              <w:t>54,89</w:t>
+              <w:t>63,88</w:t>
             </w:r>
           </w:p>
         </w:tc>
@@ -4912,10 +5020,7 @@
               </w:rPr>
             </w:pPr>
             <w:r>
-              <w:rPr>
-                <w:sz w:val="18"/>
-              </w:rPr>
-              <w:t>4,00</w:t>
+              <w:t>3,38</w:t>
             </w:r>
           </w:p>
         </w:tc>
@@ -4931,16 +5036,7 @@
               </w:rPr>
             </w:pPr>
             <w:r>
-              <w:rPr>
-                <w:sz w:val="18"/>
-              </w:rPr>
-              <w:t xml:space="preserve">1,46 </w:t>
-            </w:r>
-            <w:r>
-              <w:rPr>
-                <w:sz w:val="18"/>
-              </w:rPr>
-              <w:t>h</w:t>
+              <w:t>1,25 h</w:t>
             </w:r>
           </w:p>
         </w:tc>
@@ -4956,10 +5052,7 @@
               </w:rPr>
             </w:pPr>
             <w:r>
-              <w:rPr>
-                <w:sz w:val="18"/>
-              </w:rPr>
-              <w:t>1155,67</w:t>
+              <w:t>1003,25</w:t>
             </w:r>
           </w:p>
         </w:tc>
@@ -4980,10 +5073,7 @@
               </w:rPr>
             </w:pPr>
             <w:r>
-              <w:rPr>
-                <w:sz w:val="18"/>
-              </w:rPr>
-              <w:t>17</w:t>
+              <w:t>26</w:t>
             </w:r>
           </w:p>
         </w:tc>
@@ -4999,10 +5089,7 @@
               </w:rPr>
             </w:pPr>
             <w:r>
-              <w:rPr>
-                <w:sz w:val="18"/>
-              </w:rPr>
-              <w:t>7</w:t>
+              <w:t>8</w:t>
             </w:r>
           </w:p>
         </w:tc>
@@ -5018,10 +5105,7 @@
               </w:rPr>
             </w:pPr>
             <w:r>
-              <w:rPr>
-                <w:sz w:val="18"/>
-              </w:rPr>
-              <w:t>Yoga 100 %</w:t>
+              <w:t>Strength 100,00 %</w:t>
             </w:r>
           </w:p>
         </w:tc>
@@ -5037,10 +5121,10 @@
               </w:rPr>
             </w:pPr>
             <w:r>
-              <w:rPr>
-                <w:sz w:val="18"/>
-              </w:rPr>
-              <w:t>1 (100 %)</w:t>
+              <w:t xml:space="preserve">2 </w:t>
+            </w:r>
+            <w:r>
+              <w:t>(75,00 %)</w:t>
             </w:r>
           </w:p>
         </w:tc>
@@ -5056,10 +5140,7 @@
               </w:rPr>
             </w:pPr>
             <w:r>
-              <w:rPr>
-                <w:sz w:val="18"/>
-              </w:rPr>
-              <w:t>24,70</w:t>
+              <w:t>30,83</w:t>
             </w:r>
           </w:p>
         </w:tc>
@@ -5075,10 +5156,7 @@
               </w:rPr>
             </w:pPr>
             <w:r>
-              <w:rPr>
-                <w:sz w:val="18"/>
-              </w:rPr>
-              <w:t>67,14</w:t>
+              <w:t>69,38</w:t>
             </w:r>
           </w:p>
         </w:tc>
@@ -5094,10 +5172,7 @@
               </w:rPr>
             </w:pPr>
             <w:r>
-              <w:rPr>
-                <w:sz w:val="18"/>
-              </w:rPr>
-              <w:t>2,14</w:t>
+              <w:t>3,25</w:t>
             </w:r>
           </w:p>
         </w:tc>
@@ -5113,10 +5188,7 @@
               </w:rPr>
             </w:pPr>
             <w:r>
-              <w:rPr>
-                <w:sz w:val="18"/>
-              </w:rPr>
-              <w:t>0,91 h</w:t>
+              <w:t>1,21 h</w:t>
             </w:r>
           </w:p>
         </w:tc>
@@ -5132,10 +5204,7 @@
               </w:rPr>
             </w:pPr>
             <w:r>
-              <w:rPr>
-                <w:sz w:val="18"/>
-              </w:rPr>
-              <w:t>726,14</w:t>
+              <w:t>969,75</w:t>
             </w:r>
           </w:p>
         </w:tc>
@@ -5159,83 +5228,35 @@
         <w:rPr>
           <w:lang w:val="es-ES"/>
         </w:rPr>
-        <w:t xml:space="preserve">También se observan perfiles diferenciados dentro de un mismo </w:t>
+        <w:t xml:space="preserve">Dentro de un mismo tipo de entrenamiento se distinguen perfiles con valores biométricos y hábitos diferentes. Por ejemplo, los </w:t>
       </w:r>
       <w:proofErr w:type="spellStart"/>
       <w:r>
         <w:rPr>
           <w:lang w:val="es-ES"/>
         </w:rPr>
-        <w:t>Workout_Type</w:t>
+        <w:t>clusters</w:t>
       </w:r>
       <w:proofErr w:type="spellEnd"/>
       <w:r>
         <w:rPr>
           <w:lang w:val="es-ES"/>
         </w:rPr>
-        <w:t xml:space="preserve">. Entre </w:t>
+        <w:t xml:space="preserve"> masculinos 26 y 28 contienen usuarios </w:t>
       </w:r>
       <w:proofErr w:type="spellStart"/>
       <w:r>
         <w:rPr>
           <w:lang w:val="es-ES"/>
         </w:rPr>
-        <w:t>clusters</w:t>
+        <w:t>Strength</w:t>
       </w:r>
       <w:proofErr w:type="spellEnd"/>
       <w:r>
         <w:rPr>
           <w:lang w:val="es-ES"/>
         </w:rPr>
-        <w:t xml:space="preserve"> masculinos </w:t>
-      </w:r>
-      <w:proofErr w:type="spellStart"/>
-      <w:r>
-        <w:rPr>
-          <w:lang w:val="es-ES"/>
-        </w:rPr>
-        <w:t>Strength</w:t>
-      </w:r>
-      <w:proofErr w:type="spellEnd"/>
-      <w:r>
-        <w:rPr>
-          <w:lang w:val="es-ES"/>
-        </w:rPr>
-        <w:t xml:space="preserve">, el </w:t>
-      </w:r>
-      <w:proofErr w:type="spellStart"/>
-      <w:r>
-        <w:rPr>
-          <w:lang w:val="es-ES"/>
-        </w:rPr>
-        <w:t>cluster</w:t>
-      </w:r>
-      <w:proofErr w:type="spellEnd"/>
-      <w:r>
-        <w:rPr>
-          <w:lang w:val="es-ES"/>
-        </w:rPr>
-        <w:t xml:space="preserve"> 8 reúne 10 usuarios con BMI promedio 25,09, frecuencia 3,10 y </w:t>
-      </w:r>
-      <w:r>
-        <w:rPr>
-          <w:lang w:val="es-ES"/>
-        </w:rPr>
-        <w:t xml:space="preserve">960,70 calorías, mientras que el </w:t>
-      </w:r>
-      <w:proofErr w:type="spellStart"/>
-      <w:r>
-        <w:rPr>
-          <w:lang w:val="es-ES"/>
-        </w:rPr>
-        <w:t>cluster</w:t>
-      </w:r>
-      <w:proofErr w:type="spellEnd"/>
-      <w:r>
-        <w:rPr>
-          <w:lang w:val="es-ES"/>
-        </w:rPr>
-        <w:t xml:space="preserve"> 27 presenta BMI 30,15, frecuencia 3,75, duración 1,58 h y 1241,00 calorías. La red no está limitándose a reproducir una partición por tipo de entrenamiento.</w:t>
+        <w:t>, pero presentan promedios distintos de BMI, frecuencia semanal, duración y calorías; la actividad no constituye una regla exclusiva de asignación.</w:t>
       </w:r>
     </w:p>
     <w:p>
@@ -5263,13 +5284,7 @@
         <w:rPr>
           <w:lang w:val="es-ES"/>
         </w:rPr>
-        <w:t xml:space="preserve"> fue aproxim</w:t>
-      </w:r>
-      <w:r>
-        <w:rPr>
-          <w:lang w:val="es-ES"/>
-        </w:rPr>
-        <w:t>adamente 71.5 %. Nuevamente, se utiliza como información descriptiva externa y no como validación supervisada.</w:t>
+        <w:t xml:space="preserve"> fue de 70,14 % en el conjunto masculino. Esta variable no intervino en el entrenamiento: se emplea únicamente como referencia descriptiva externa y no como validación supervisada.</w:t>
       </w:r>
     </w:p>
     <w:p>
@@ -5309,10 +5324,6 @@
               </w:rPr>
             </w:pPr>
             <w:r>
-              <w:rPr>
-                <w:b/>
-                <w:sz w:val="18"/>
-              </w:rPr>
               <w:t>Indicador</w:t>
             </w:r>
           </w:p>
@@ -5330,10 +5341,6 @@
               </w:rPr>
             </w:pPr>
             <w:r>
-              <w:rPr>
-                <w:b/>
-                <w:sz w:val="18"/>
-              </w:rPr>
               <w:t>Femenino</w:t>
             </w:r>
           </w:p>
@@ -5351,10 +5358,6 @@
               </w:rPr>
             </w:pPr>
             <w:r>
-              <w:rPr>
-                <w:b/>
-                <w:sz w:val="18"/>
-              </w:rPr>
               <w:t>Masculino</w:t>
             </w:r>
           </w:p>
@@ -5376,9 +5379,6 @@
               </w:rPr>
             </w:pPr>
             <w:r>
-              <w:rPr>
-                <w:sz w:val="18"/>
-              </w:rPr>
               <w:t>Perfiles procesados</w:t>
             </w:r>
           </w:p>
@@ -5395,9 +5395,6 @@
               </w:rPr>
             </w:pPr>
             <w:r>
-              <w:rPr>
-                <w:sz w:val="18"/>
-              </w:rPr>
               <w:t>215</w:t>
             </w:r>
           </w:p>
@@ -5414,10 +5411,7 @@
               </w:rPr>
             </w:pPr>
             <w:r>
-              <w:rPr>
-                <w:sz w:val="18"/>
-              </w:rPr>
-              <w:t>242</w:t>
+              <w:t>221</w:t>
             </w:r>
           </w:p>
         </w:tc>
@@ -5438,9 +5432,6 @@
               </w:rPr>
             </w:pPr>
             <w:r>
-              <w:rPr>
-                <w:sz w:val="18"/>
-              </w:rPr>
               <w:t>Clusters</w:t>
             </w:r>
           </w:p>
@@ -5457,9 +5448,6 @@
               </w:rPr>
             </w:pPr>
             <w:r>
-              <w:rPr>
-                <w:sz w:val="18"/>
-              </w:rPr>
               <w:t>44</w:t>
             </w:r>
           </w:p>
@@ -5476,10 +5464,7 @@
               </w:rPr>
             </w:pPr>
             <w:r>
-              <w:rPr>
-                <w:sz w:val="18"/>
-              </w:rPr>
-              <w:t>45</w:t>
+              <w:t>53</w:t>
             </w:r>
           </w:p>
         </w:tc>
@@ -5500,16 +5485,7 @@
               </w:rPr>
             </w:pPr>
             <w:r>
-              <w:rPr>
-                <w:sz w:val="18"/>
-              </w:rPr>
-              <w:t xml:space="preserve">Clusters 100 % homogéneos en </w:t>
-            </w:r>
-            <w:r>
-              <w:rPr>
-                <w:sz w:val="18"/>
-              </w:rPr>
-              <w:t>Workout_Type</w:t>
+              <w:t>Clusters 100 % homogéneos en Workout_Type</w:t>
             </w:r>
           </w:p>
         </w:tc>
@@ -5525,9 +5501,6 @@
               </w:rPr>
             </w:pPr>
             <w:r>
-              <w:rPr>
-                <w:sz w:val="18"/>
-              </w:rPr>
               <w:t>37</w:t>
             </w:r>
           </w:p>
@@ -5544,10 +5517,7 @@
               </w:rPr>
             </w:pPr>
             <w:r>
-              <w:rPr>
-                <w:sz w:val="18"/>
-              </w:rPr>
-              <w:t>42</w:t>
+              <w:t>39</w:t>
             </w:r>
           </w:p>
         </w:tc>
@@ -5568,9 +5538,6 @@
               </w:rPr>
             </w:pPr>
             <w:r>
-              <w:rPr>
-                <w:sz w:val="18"/>
-              </w:rPr>
               <w:t>Coherencia ponderada Workout_Type</w:t>
             </w:r>
           </w:p>
@@ -5587,10 +5554,7 @@
               </w:rPr>
             </w:pPr>
             <w:r>
-              <w:rPr>
-                <w:sz w:val="18"/>
-              </w:rPr>
-              <w:t>≈95,8 %</w:t>
+              <w:t>95,81 %</w:t>
             </w:r>
           </w:p>
         </w:tc>
@@ -5606,10 +5570,7 @@
               </w:rPr>
             </w:pPr>
             <w:r>
-              <w:rPr>
-                <w:sz w:val="18"/>
-              </w:rPr>
-              <w:t>≈97,9 %</w:t>
+              <w:t>93,21 %</w:t>
             </w:r>
           </w:p>
         </w:tc>
@@ -5630,9 +5591,6 @@
               </w:rPr>
             </w:pPr>
             <w:r>
-              <w:rPr>
-                <w:sz w:val="18"/>
-              </w:rPr>
               <w:lastRenderedPageBreak/>
               <w:t>Clusters con ≤3 usuarios</w:t>
             </w:r>
@@ -5650,9 +5608,6 @@
               </w:rPr>
             </w:pPr>
             <w:r>
-              <w:rPr>
-                <w:sz w:val="18"/>
-              </w:rPr>
               <w:t>12</w:t>
             </w:r>
           </w:p>
@@ -5669,10 +5624,7 @@
               </w:rPr>
             </w:pPr>
             <w:r>
-              <w:rPr>
-                <w:sz w:val="18"/>
-              </w:rPr>
-              <w:t>6</w:t>
+              <w:t>24</w:t>
             </w:r>
           </w:p>
         </w:tc>
@@ -5693,9 +5645,6 @@
               </w:rPr>
             </w:pPr>
             <w:r>
-              <w:rPr>
-                <w:sz w:val="18"/>
-              </w:rPr>
               <w:t>Singletons</w:t>
             </w:r>
           </w:p>
@@ -5712,9 +5661,6 @@
               </w:rPr>
             </w:pPr>
             <w:r>
-              <w:rPr>
-                <w:sz w:val="18"/>
-              </w:rPr>
               <w:t>1</w:t>
             </w:r>
           </w:p>
@@ -5731,9 +5677,6 @@
               </w:rPr>
             </w:pPr>
             <w:r>
-              <w:rPr>
-                <w:sz w:val="18"/>
-              </w:rPr>
               <w:t>1</w:t>
             </w:r>
           </w:p>
@@ -5755,9 +5698,6 @@
               </w:rPr>
             </w:pPr>
             <w:r>
-              <w:rPr>
-                <w:sz w:val="18"/>
-              </w:rPr>
               <w:t>Mayor cluster</w:t>
             </w:r>
           </w:p>
@@ -5774,9 +5714,6 @@
               </w:rPr>
             </w:pPr>
             <w:r>
-              <w:rPr>
-                <w:sz w:val="18"/>
-              </w:rPr>
               <w:t>11 usuarios</w:t>
             </w:r>
           </w:p>
@@ -5793,9 +5730,6 @@
               </w:rPr>
             </w:pPr>
             <w:r>
-              <w:rPr>
-                <w:sz w:val="18"/>
-              </w:rPr>
               <w:t>10 usuarios</w:t>
             </w:r>
           </w:p>
@@ -5817,9 +5751,6 @@
               </w:rPr>
             </w:pPr>
             <w:r>
-              <w:rPr>
-                <w:sz w:val="18"/>
-              </w:rPr>
               <w:t>Predominancia ponderada Experience_Level</w:t>
             </w:r>
           </w:p>
@@ -5836,10 +5767,7 @@
               </w:rPr>
             </w:pPr>
             <w:r>
-              <w:rPr>
-                <w:sz w:val="18"/>
-              </w:rPr>
-              <w:t>≈66,5 %</w:t>
+              <w:t>66,51 %</w:t>
             </w:r>
           </w:p>
         </w:tc>
@@ -5855,10 +5783,7 @@
               </w:rPr>
             </w:pPr>
             <w:r>
-              <w:rPr>
-                <w:sz w:val="18"/>
-              </w:rPr>
-              <w:t>≈71,5 %</w:t>
+              <w:t>70,14 %</w:t>
             </w:r>
           </w:p>
         </w:tc>
@@ -5882,13 +5807,16 @@
         <w:rPr>
           <w:lang w:val="es-ES"/>
         </w:rPr>
-        <w:t xml:space="preserve">Ambas corridas presentan un número muy </w:t>
-      </w:r>
-      <w:r>
-        <w:rPr>
-          <w:lang w:val="es-ES"/>
-        </w:rPr>
-        <w:t xml:space="preserve">similar de </w:t>
+        <w:t xml:space="preserve">Con </w:t>
+      </w:r>
+      <w:r>
+        <w:t>ρ</w:t>
+      </w:r>
+      <w:r>
+        <w:rPr>
+          <w:lang w:val="es-ES"/>
+        </w:rPr>
+        <w:t xml:space="preserve">=0,70, el conjunto femenino produjo 44 </w:t>
       </w:r>
       <w:proofErr w:type="spellStart"/>
       <w:r>
@@ -5902,55 +5830,7 @@
         <w:rPr>
           <w:lang w:val="es-ES"/>
         </w:rPr>
-        <w:t xml:space="preserve"> pese a tener distinta cantidad de registros. El conjunto masculino mostró mayor homogeneidad respecto de </w:t>
-      </w:r>
-      <w:proofErr w:type="spellStart"/>
-      <w:r>
-        <w:rPr>
-          <w:lang w:val="es-ES"/>
-        </w:rPr>
-        <w:t>Workout_Type</w:t>
-      </w:r>
-      <w:proofErr w:type="spellEnd"/>
-      <w:r>
-        <w:rPr>
-          <w:lang w:val="es-ES"/>
-        </w:rPr>
-        <w:t xml:space="preserve"> y menor presencia de </w:t>
-      </w:r>
-      <w:proofErr w:type="spellStart"/>
-      <w:r>
-        <w:rPr>
-          <w:lang w:val="es-ES"/>
-        </w:rPr>
-        <w:t>clusters</w:t>
-      </w:r>
-      <w:proofErr w:type="spellEnd"/>
-      <w:r>
-        <w:rPr>
-          <w:lang w:val="es-ES"/>
-        </w:rPr>
-        <w:t xml:space="preserve"> pequeños. Estas diferencias se describen como propiedades de los conjuntos analizados y </w:t>
-      </w:r>
-      <w:r>
-        <w:rPr>
-          <w:lang w:val="es-ES"/>
-        </w:rPr>
-        <w:t xml:space="preserve">no como evidencia de que un </w:t>
-      </w:r>
-      <w:proofErr w:type="spellStart"/>
-      <w:r>
-        <w:rPr>
-          <w:lang w:val="es-ES"/>
-        </w:rPr>
-        <w:t>dataset</w:t>
-      </w:r>
-      <w:proofErr w:type="spellEnd"/>
-      <w:r>
-        <w:rPr>
-          <w:lang w:val="es-ES"/>
-        </w:rPr>
-        <w:t xml:space="preserve"> o grupo sea 'mejor'.</w:t>
+        <w:t xml:space="preserve"> sobre 215 registros y el masculino 53 sobre 221. La coherencia descriptiva fue mayor en el conjunto femenino (95,81 % frente a 93,21 %), mientras que el masculino mostró más grupos pequeños (24 frente a 12). La diferencia no puede atribuirse directamente al género, que no es una entrada de la red, y puede relacionarse con la composición y el orden de los registros.</w:t>
       </w:r>
     </w:p>
     <w:p>
@@ -5978,7 +5858,7 @@
         <w:rPr>
           <w:lang w:val="es-ES"/>
         </w:rPr>
-        <w:t xml:space="preserve">Los resultados permiten sostener que la red generó agrupamientos interpretables dentro del alcance del proyecto. La alta coherencia respecto de </w:t>
+        <w:t xml:space="preserve">Los resultados muestran que el módulo genera agrupamientos interpretables para el alcance académico planteado. </w:t>
       </w:r>
       <w:proofErr w:type="spellStart"/>
       <w:r>
@@ -5992,27 +5872,21 @@
         <w:rPr>
           <w:lang w:val="es-ES"/>
         </w:rPr>
-        <w:t xml:space="preserve"> muestra que</w:t>
-      </w:r>
-      <w:r>
-        <w:rPr>
-          <w:lang w:val="es-ES"/>
-        </w:rPr>
-        <w:t xml:space="preserve"> esta variable participa de forma relevante en la similitud, pero el análisis de </w:t>
+        <w:t xml:space="preserve"> tiene una presencia importante en los grupos, aunque también intervienen las variables numéricas normalizadas. La coherencia por actividad no equivale a una medida de calidad universal del </w:t>
       </w:r>
       <w:proofErr w:type="spellStart"/>
       <w:r>
         <w:rPr>
           <w:lang w:val="es-ES"/>
         </w:rPr>
-        <w:t>clusters</w:t>
+        <w:t>clustering</w:t>
       </w:r>
       <w:proofErr w:type="spellEnd"/>
       <w:r>
         <w:rPr>
           <w:lang w:val="es-ES"/>
         </w:rPr>
-        <w:t xml:space="preserve"> con el mismo tipo predominante demuestra que las variables biométricas y de hábitos también influyen en la formación de categorías.</w:t>
+        <w:t xml:space="preserve"> y debe interpretarse junto con la fragmentación.</w:t>
       </w:r>
     </w:p>
     <w:p>
@@ -6026,13 +5900,7 @@
         <w:rPr>
           <w:lang w:val="es-ES"/>
         </w:rPr>
-        <w:t xml:space="preserve">Al mismo tiempo, la existencia de </w:t>
-      </w:r>
-      <w:r>
-        <w:rPr>
-          <w:lang w:val="es-ES"/>
-        </w:rPr>
-        <w:t xml:space="preserve">algunos </w:t>
+        <w:t xml:space="preserve">Los </w:t>
       </w:r>
       <w:proofErr w:type="spellStart"/>
       <w:r>
@@ -6046,7 +5914,16 @@
         <w:rPr>
           <w:lang w:val="es-ES"/>
         </w:rPr>
-        <w:t xml:space="preserve"> mixtos es esperable y útil: la red no recibe una regla que obligue a separar los tipos de entrenamiento. En el conjunto femenino existen 7 </w:t>
+        <w:t xml:space="preserve"> mixtos son esperables porque la red no recibe etiquetas de clase que obliguen a separar actividades. Con </w:t>
+      </w:r>
+      <w:r>
+        <w:t>ρ</w:t>
+      </w:r>
+      <w:r>
+        <w:rPr>
+          <w:lang w:val="es-ES"/>
+        </w:rPr>
+        <w:t xml:space="preserve">=0,70, hay 7 </w:t>
       </w:r>
       <w:proofErr w:type="spellStart"/>
       <w:r>
@@ -6060,13 +5937,21 @@
         <w:rPr>
           <w:lang w:val="es-ES"/>
         </w:rPr>
-        <w:t xml:space="preserve"> no completamente homogéneos y en el masculino 3. Esto confirma que el resultado emerge del </w:t>
-      </w:r>
-      <w:r>
-        <w:rPr>
-          <w:lang w:val="es-ES"/>
-        </w:rPr>
-        <w:t>conjunto de características y del criterio de vigilancia.</w:t>
+        <w:t xml:space="preserve"> no homogéneos por </w:t>
+      </w:r>
+      <w:proofErr w:type="spellStart"/>
+      <w:r>
+        <w:rPr>
+          <w:lang w:val="es-ES"/>
+        </w:rPr>
+        <w:t>Workout_Type</w:t>
+      </w:r>
+      <w:proofErr w:type="spellEnd"/>
+      <w:r>
+        <w:rPr>
+          <w:lang w:val="es-ES"/>
+        </w:rPr>
+        <w:t xml:space="preserve"> en el conjunto femenino y 14 en el masculino. Esta observación no constituye por sí sola un fallo del algoritmo.</w:t>
       </w:r>
     </w:p>
     <w:p>
@@ -6102,13 +5987,7 @@
         <w:rPr>
           <w:lang w:val="es-ES"/>
         </w:rPr>
-        <w:t>. Esto no constituye un error, porque fue excluido del entrenamiento. Su distribución sirve únicamente para aportar contexto sobr</w:t>
-      </w:r>
-      <w:r>
-        <w:rPr>
-          <w:lang w:val="es-ES"/>
-        </w:rPr>
-        <w:t>e los grupos obtenidos.</w:t>
+        <w:t>. Esto no constituye un error, porque fue excluido del entrenamiento. Su distribución sirve únicamente para aportar contexto sobre los grupos obtenidos.</w:t>
       </w:r>
     </w:p>
     <w:p>
@@ -6188,13 +6067,7 @@
         <w:rPr>
           <w:lang w:val="es-ES"/>
         </w:rPr>
-        <w:t xml:space="preserve"> </w:t>
-      </w:r>
-      <w:r>
-        <w:rPr>
-          <w:lang w:val="es-ES"/>
-        </w:rPr>
-        <w:t xml:space="preserve">ART y no reproduce todos los elementos del algoritmo canónico, como </w:t>
+        <w:t xml:space="preserve"> ART y no reproduce todos los elementos del algoritmo canónico, como </w:t>
       </w:r>
       <w:proofErr w:type="spellStart"/>
       <w:r>
@@ -6266,13 +6139,7 @@
         <w:rPr>
           <w:lang w:val="es-ES"/>
         </w:rPr>
-        <w:t>El indicador de coherencia</w:t>
-      </w:r>
-      <w:r>
-        <w:rPr>
-          <w:lang w:val="es-ES"/>
-        </w:rPr>
-        <w:t xml:space="preserve"> de </w:t>
+        <w:t xml:space="preserve">El indicador de coherencia de </w:t>
       </w:r>
       <w:proofErr w:type="spellStart"/>
       <w:r>
@@ -6329,7 +6196,7 @@
         <w:rPr>
           <w:lang w:val="es-ES"/>
         </w:rPr>
-        <w:t xml:space="preserve">Las corridas permitieron verificar el funcionamiento del módulo sobre ambos conjuntos de prueba y analizar el efecto del parámetro de vigilancia. La configuración </w:t>
+        <w:t xml:space="preserve">La evaluación definitiva se realizó con dos conjuntos derivados de una misma fuente, balanceados inicialmente a 462 registros por grupo mediante selección aleatoria reproducible de registros masculinos. Después del filtro etario quedaron 215 perfiles femeninos y 221 masculinos. Con </w:t>
       </w:r>
       <w:r>
         <w:t>ρ</w:t>
@@ -6338,7 +6205,7 @@
         <w:rPr>
           <w:lang w:val="es-ES"/>
         </w:rPr>
-        <w:t xml:space="preserve">=0,70 produjo 44 </w:t>
+        <w:t xml:space="preserve">=0,70 se obtuvieron respectivamente 44 y 53 </w:t>
       </w:r>
       <w:proofErr w:type="spellStart"/>
       <w:r>
@@ -6352,13 +6219,7 @@
         <w:rPr>
           <w:lang w:val="es-ES"/>
         </w:rPr>
-        <w:t xml:space="preserve"> para 215 perfiles femeninos y 45 para 242 perfiles masculinos, co</w:t>
-      </w:r>
-      <w:r>
-        <w:rPr>
-          <w:lang w:val="es-ES"/>
-        </w:rPr>
-        <w:t xml:space="preserve">n alta coherencia descriptiva respecto de </w:t>
+        <w:t xml:space="preserve">, con coherencias descriptivas por </w:t>
       </w:r>
       <w:proofErr w:type="spellStart"/>
       <w:r>
@@ -6372,16 +6233,7 @@
         <w:rPr>
           <w:lang w:val="es-ES"/>
         </w:rPr>
-        <w:t xml:space="preserve"> y una fragmentación menor que la observada con </w:t>
-      </w:r>
-      <w:r>
-        <w:t>ρ</w:t>
-      </w:r>
-      <w:r>
-        <w:rPr>
-          <w:lang w:val="es-ES"/>
-        </w:rPr>
-        <w:t>=0,75.</w:t>
+        <w:t xml:space="preserve"> de 95,81 % y 93,21 %.</w:t>
       </w:r>
     </w:p>
     <w:p>
@@ -6395,57 +6247,32 @@
         <w:rPr>
           <w:lang w:val="es-ES"/>
         </w:rPr>
+        <w:t xml:space="preserve">Las 14 corridas nuevas permiten justificar la elección de </w:t>
+      </w:r>
+      <w:r>
+        <w:t>ρ</w:t>
+      </w:r>
+      <w:r>
+        <w:rPr>
+          <w:lang w:val="es-ES"/>
+        </w:rPr>
+        <w:t xml:space="preserve">=0,70 como compromiso para ambos conjuntos, especialmente por la menor fragmentación femenina frente a 0,75. No obstante, </w:t>
+      </w:r>
+      <w:r>
+        <w:t>ρ</w:t>
+      </w:r>
+      <w:r>
+        <w:rPr>
+          <w:lang w:val="es-ES"/>
+        </w:rPr>
+        <w:t xml:space="preserve">=0,75 mejoró simultáneamente </w:t>
+      </w:r>
+      <w:r>
+        <w:rPr>
+          <w:lang w:val="es-ES"/>
+        </w:rPr>
         <w:lastRenderedPageBreak/>
-        <w:t xml:space="preserve">La selección de </w:t>
-      </w:r>
-      <w:r>
-        <w:t>ρ</w:t>
-      </w:r>
-      <w:r>
-        <w:rPr>
-          <w:lang w:val="es-ES"/>
-        </w:rPr>
-        <w:t>=0,70 se fundamenta, por lo tanto, en evidencia experimental del proyecto: aumentar la vigilancia a 0,75 mejoró solo marginalment</w:t>
-      </w:r>
-      <w:r>
-        <w:rPr>
-          <w:lang w:val="es-ES"/>
-        </w:rPr>
-        <w:t xml:space="preserve">e la homogeneidad, pero incrementó considerablemente los grupos pequeños. Asimismo, los ejemplos analizados muestran que perfiles con un mismo </w:t>
-      </w:r>
-      <w:proofErr w:type="spellStart"/>
-      <w:r>
-        <w:rPr>
-          <w:lang w:val="es-ES"/>
-        </w:rPr>
-        <w:t>Workout_Type</w:t>
-      </w:r>
-      <w:proofErr w:type="spellEnd"/>
-      <w:r>
-        <w:rPr>
-          <w:lang w:val="es-ES"/>
-        </w:rPr>
-        <w:t xml:space="preserve"> pueden pertenecer a </w:t>
-      </w:r>
-      <w:proofErr w:type="spellStart"/>
-      <w:r>
-        <w:rPr>
-          <w:lang w:val="es-ES"/>
-        </w:rPr>
-        <w:t>clusters</w:t>
-      </w:r>
-      <w:proofErr w:type="spellEnd"/>
-      <w:r>
-        <w:rPr>
-          <w:lang w:val="es-ES"/>
-        </w:rPr>
-        <w:t xml:space="preserve"> diferentes debido a sus características biométricas y hábitos de entren</w:t>
-      </w:r>
-      <w:r>
-        <w:rPr>
-          <w:lang w:val="es-ES"/>
-        </w:rPr>
-        <w:t>amiento.</w:t>
+        <w:t>la coherencia y los indicadores de fragmentación en el conjunto masculino, por lo que no sería correcto presentarlo como una configuración inferior en todos los casos. La elección es contextual y no demuestra un valor óptimo general.</w:t>
       </w:r>
     </w:p>
     <w:p>
@@ -6459,13 +6286,7 @@
         <w:rPr>
           <w:lang w:val="es-ES"/>
         </w:rPr>
-        <w:t>En conjunto, los resultados son compatibles con el objetivo académico de obtener agrupamientos adaptativos e interpretables. No obstante, deben considerarse las limitaciones de los datos y de la implementación simplificada antes de generalizar los</w:t>
-      </w:r>
-      <w:r>
-        <w:rPr>
-          <w:lang w:val="es-ES"/>
-        </w:rPr>
-        <w:t xml:space="preserve"> resultados a otros contextos.</w:t>
+        <w:t>En conjunto, los resultados son compatibles con el objetivo académico de obtener agrupamientos adaptativos e interpretables. No obstante, deben considerarse las limitaciones de los datos y de la implementación simplificada antes de generalizar los resultados a otros contextos.</w:t>
       </w:r>
     </w:p>
     <w:p>
@@ -6533,10 +6354,7 @@
         </w:rPr>
       </w:pPr>
       <w:r>
-        <w:t xml:space="preserve">Carpenter, G. A., Grossberg, S. y Rosen, D. B. (1991). Fuzzy ART: Fast </w:t>
-      </w:r>
-      <w:r>
-        <w:t>stable learning and categorization of analog patterns by an adaptive resonance system. Neural Networks, 4(6), 759-771. DOI: 10.1016/0893-6080(91)90056-B.</w:t>
+        <w:t>Carpenter, G. A., Grossberg, S. y Rosen, D. B. (1991). Fuzzy ART: Fast stable learning and categorization of analog patterns by an adaptive resonance system. Neural Networks, 4(6), 759-771. DOI: 10.1016/0893-6080(91)90056-B.</w:t>
       </w:r>
     </w:p>
     <w:p>
@@ -6546,14 +6364,11 @@
         </w:rPr>
       </w:pPr>
       <w:r>
-        <w:t>Carpenter, G. A. y Grossberg, S. (1987). ART 2: Self-organization of stable category recognition codes</w:t>
-      </w:r>
-      <w:r>
-        <w:t xml:space="preserve"> for analog input patterns. Applied Optics, 26(23), 4919-4930.</w:t>
+        <w:t>Carpenter, G. A. y Grossberg, S. (1987). ART 2: Self-organization of stable category recognition codes for analog input patterns. Applied Optics, 26(23), 4919-4930.</w:t>
       </w:r>
     </w:p>
     <w:sectPr>
-      <w:footerReference w:type="default" r:id="rId10"/>
+      <w:footerReference w:type="default" r:id="rId14"/>
       <w:pgSz w:w="12240" w:h="15840"/>
       <w:pgMar w:top="1247" w:right="1361" w:bottom="1134" w:left="1361" w:header="720" w:footer="720" w:gutter="0"/>
       <w:cols w:space="720"/>
@@ -18223,6 +18038,22 @@
       </w:tcPr>
     </w:tblStylePr>
   </w:style>
+  <w:style w:type="paragraph" w:styleId="NormalWeb">
+    <w:name w:val="Normal (Web)"/>
+    <w:basedOn w:val="Normal"/>
+    <w:uiPriority w:val="99"/>
+    <w:semiHidden/>
+    <w:unhideWhenUsed/>
+    <w:rsid w:val="00D5647B"/>
+    <w:pPr>
+      <w:spacing w:before="100" w:beforeAutospacing="1" w:after="100" w:afterAutospacing="1" w:line="240" w:lineRule="auto"/>
+    </w:pPr>
+    <w:rPr>
+      <w:rFonts w:ascii="Times New Roman" w:eastAsia="Times New Roman" w:hAnsi="Times New Roman" w:cs="Times New Roman"/>
+      <w:sz w:val="24"/>
+      <w:szCs w:val="24"/>
+    </w:rPr>
+  </w:style>
 </w:styles>
 </file>
 
@@ -18551,7 +18382,7 @@
 </file>
 
 <file path=customXml/itemProps1.xml><?xml version="1.0" encoding="utf-8"?>
-<ds:datastoreItem xmlns:ds="http://schemas.openxmlformats.org/officeDocument/2006/customXml" ds:itemID="{31959A98-2702-488D-A858-D2A387D2CBD4}">
+<ds:datastoreItem xmlns:ds="http://schemas.openxmlformats.org/officeDocument/2006/customXml" ds:itemID="{1C2F8D1D-1599-426E-A1DC-3F26A30EF4F9}">
   <ds:schemaRefs>
     <ds:schemaRef ds:uri="http://schemas.openxmlformats.org/officeDocument/2006/bibliography"/>
   </ds:schemaRefs>

</xml_diff>